<commit_message>
finished exercise set 4 logic
</commit_message>
<xml_diff>
--- a/Fall-2025/logic-for-cs/exercise-set-4.docx
+++ b/Fall-2025/logic-for-cs/exercise-set-4.docx
@@ -6584,23 +6584,17 @@
             <w:r>
               <w:rPr>
                 <w:rFonts w:ascii="Cambria Math" w:hAnsi="Cambria Math" w:cs="Cambria Math"/>
-                <w:b/>
+              </w:rPr>
+              <w:t>∧</w:t>
+            </w:r>
+            <w:r>
+              <w:t xml:space="preserve"> (</w:t>
+            </w:r>
+            <w:r>
+              <w:rPr>
                 <w:bCs/>
               </w:rPr>
-              <w:t>∧</w:t>
-            </w:r>
-            <w:r>
-              <w:rPr>
-                <w:b/>
-                <w:bCs/>
-              </w:rPr>
-              <w:t xml:space="preserve"> </w:t>
-            </w:r>
-            <w:r>
-              <w:rPr>
-                <w:bCs/>
-              </w:rPr>
-              <w:t>(¬R</w:t>
+              <w:t>¬R</w:t>
             </w:r>
             <w:r>
               <w:rPr>
@@ -6628,35 +6622,32 @@
               <w:rPr>
                 <w:bCs/>
               </w:rPr>
-              <w:t>S)</w:t>
-            </w:r>
-            <w:r>
-              <w:rPr>
-                <w:b/>
+              <w:t>S</w:t>
+            </w:r>
+            <w:r>
+              <w:rPr>
                 <w:bCs/>
               </w:rPr>
-              <w:t xml:space="preserve"> </w:t>
+              <w:t xml:space="preserve">) </w:t>
             </w:r>
             <w:r>
               <w:rPr>
                 <w:rFonts w:ascii="Cambria Math" w:hAnsi="Cambria Math" w:cs="Cambria Math"/>
-                <w:b/>
                 <w:bCs/>
               </w:rPr>
               <w:t>∧</w:t>
             </w:r>
             <w:r>
               <w:rPr>
-                <w:b/>
                 <w:bCs/>
               </w:rPr>
-              <w:t xml:space="preserve"> </w:t>
+              <w:t xml:space="preserve"> (</w:t>
             </w:r>
             <w:r>
               <w:rPr>
                 <w:bCs/>
               </w:rPr>
-              <w:t>(P</w:t>
+              <w:t>P</w:t>
             </w:r>
             <w:r>
               <w:rPr>
@@ -7535,22 +7526,13 @@
         <w:t xml:space="preserve"> ¬B</w:t>
       </w:r>
       <w:r>
-        <w:t xml:space="preserve">) = </w:t>
-      </w:r>
-      <w:r>
-        <w:t>0</w:t>
-      </w:r>
-      <w:r>
-        <w:t xml:space="preserve"> or A(</w:t>
+        <w:t>) = 0 or A(</w:t>
       </w:r>
       <w:r>
         <w:t>F</w:t>
       </w:r>
       <w:r>
-        <w:t xml:space="preserve">) = </w:t>
-      </w:r>
-      <w:r>
-        <w:t>0</w:t>
+        <w:t>) = 0</w:t>
       </w:r>
     </w:p>
     <w:p>
@@ -7611,22 +7593,13 @@
         <w:t>(</w:t>
       </w:r>
       <w:r>
-        <w:t>I</w:t>
-      </w:r>
-      <w:r>
-        <w:t xml:space="preserve">) = </w:t>
-      </w:r>
-      <w:r>
-        <w:t>1 or A(</w:t>
+        <w:t>I) = 1 or A(</w:t>
       </w:r>
       <w:r>
         <w:t>¬B</w:t>
       </w:r>
       <w:r>
-        <w:t>) = 1</w:t>
-      </w:r>
-      <w:r>
-        <w:t xml:space="preserve"> or A(</w:t>
+        <w:t>) = 1 or A(</w:t>
       </w:r>
       <w:r>
         <w:t>F</w:t>
@@ -7699,13 +7672,7 @@
         <w:t>B</w:t>
       </w:r>
       <w:r>
-        <w:t xml:space="preserve">) = </w:t>
-      </w:r>
-      <w:r>
-        <w:t>0</w:t>
-      </w:r>
-      <w:r>
-        <w:t xml:space="preserve"> or A(</w:t>
+        <w:t>) = 0 or A(</w:t>
       </w:r>
       <w:r>
         <w:t>F</w:t>
@@ -8101,15 +8068,7 @@
                 <w:sz w:val="22"/>
                 <w:szCs w:val="22"/>
               </w:rPr>
-              <w:t>(</w:t>
-            </w:r>
-            <w:r>
-              <w:rPr>
-                <w:color w:val="000000"/>
-                <w:sz w:val="22"/>
-                <w:szCs w:val="22"/>
-              </w:rPr>
-              <w:t>I</w:t>
+              <w:t>(I</w:t>
             </w:r>
             <w:r>
               <w:rPr>
@@ -8134,15 +8093,7 @@
                 <w:sz w:val="22"/>
                 <w:szCs w:val="22"/>
               </w:rPr>
-              <w:t>B</w:t>
-            </w:r>
-            <w:r>
-              <w:rPr>
-                <w:color w:val="000000"/>
-                <w:sz w:val="22"/>
-                <w:szCs w:val="22"/>
-              </w:rPr>
-              <w:t>)</w:t>
+              <w:t>B)</w:t>
             </w:r>
             <w:r>
               <w:rPr>
@@ -9871,6 +9822,3149 @@
       </w:r>
       <w:r>
         <w:t xml:space="preserve"> = 0</w:t>
+      </w:r>
+    </w:p>
+    <w:p>
+      <w:pPr>
+        <w:rPr>
+          <w:b/>
+          <w:bCs/>
+        </w:rPr>
+      </w:pPr>
+      <w:r>
+        <w:rPr>
+          <w:b/>
+          <w:bCs/>
+        </w:rPr>
+        <w:t>Exercise 34</w:t>
+      </w:r>
+    </w:p>
+    <w:p>
+      <w:pPr>
+        <w:rPr>
+          <w:bCs/>
+        </w:rPr>
+      </w:pPr>
+      <w:r>
+        <w:t xml:space="preserve">modus tollens: </w:t>
+      </w:r>
+      <w:r>
+        <w:rPr>
+          <w:bCs/>
+        </w:rPr>
+        <w:t>(</w:t>
+      </w:r>
+      <w:r>
+        <w:rPr>
+          <w:bCs/>
+        </w:rPr>
+        <w:t>(</w:t>
+      </w:r>
+      <w:r>
+        <w:rPr>
+          <w:bCs/>
+        </w:rPr>
+        <w:t>P</w:t>
+      </w:r>
+      <w:r>
+        <w:rPr>
+          <w:b/>
+          <w:bCs/>
+        </w:rPr>
+        <w:t xml:space="preserve"> → </w:t>
+      </w:r>
+      <w:r>
+        <w:rPr>
+          <w:bCs/>
+        </w:rPr>
+        <w:t>Q)</w:t>
+      </w:r>
+      <w:r>
+        <w:rPr>
+          <w:bCs/>
+        </w:rPr>
+        <w:t xml:space="preserve"> </w:t>
+      </w:r>
+      <w:r>
+        <w:rPr>
+          <w:rFonts w:ascii="Cambria Math" w:hAnsi="Cambria Math" w:cs="Cambria Math"/>
+          <w:bCs/>
+        </w:rPr>
+        <w:t>∧</w:t>
+      </w:r>
+      <w:r>
+        <w:rPr>
+          <w:rFonts w:ascii="Cambria Math" w:hAnsi="Cambria Math" w:cs="Cambria Math"/>
+          <w:bCs/>
+        </w:rPr>
+        <w:t xml:space="preserve"> </w:t>
+      </w:r>
+      <w:r>
+        <w:rPr>
+          <w:bCs/>
+        </w:rPr>
+        <w:t>¬</w:t>
+      </w:r>
+      <w:r>
+        <w:rPr>
+          <w:bCs/>
+        </w:rPr>
+        <w:t>Q</w:t>
+      </w:r>
+      <w:r>
+        <w:rPr>
+          <w:bCs/>
+        </w:rPr>
+        <w:t>)</w:t>
+      </w:r>
+      <w:r>
+        <w:rPr>
+          <w:b/>
+          <w:bCs/>
+        </w:rPr>
+        <w:t xml:space="preserve"> →</w:t>
+      </w:r>
+      <w:r>
+        <w:rPr>
+          <w:b/>
+          <w:bCs/>
+        </w:rPr>
+        <w:t xml:space="preserve"> </w:t>
+      </w:r>
+      <w:r>
+        <w:rPr>
+          <w:bCs/>
+        </w:rPr>
+        <w:t>¬</w:t>
+      </w:r>
+      <w:r>
+        <w:rPr>
+          <w:bCs/>
+        </w:rPr>
+        <w:t>P</w:t>
+      </w:r>
+    </w:p>
+    <w:p>
+      <w:pPr>
+        <w:rPr>
+          <w:bCs/>
+        </w:rPr>
+      </w:pPr>
+      <w:r>
+        <w:rPr>
+          <w:bCs/>
+        </w:rPr>
+        <w:t xml:space="preserve">modus tollendo ponens ((P </w:t>
+      </w:r>
+      <w:r>
+        <w:rPr>
+          <w:rFonts w:ascii="Cambria Math" w:hAnsi="Cambria Math" w:cs="Cambria Math"/>
+          <w:color w:val="000000"/>
+          <w:sz w:val="22"/>
+          <w:szCs w:val="22"/>
+        </w:rPr>
+        <w:t>∨</w:t>
+      </w:r>
+      <w:r>
+        <w:rPr>
+          <w:rFonts w:ascii="Cambria Math" w:hAnsi="Cambria Math" w:cs="Cambria Math"/>
+          <w:color w:val="000000"/>
+          <w:sz w:val="22"/>
+          <w:szCs w:val="22"/>
+        </w:rPr>
+        <w:t xml:space="preserve"> Q) </w:t>
+      </w:r>
+      <w:r>
+        <w:rPr>
+          <w:rFonts w:ascii="Cambria Math" w:hAnsi="Cambria Math" w:cs="Cambria Math"/>
+          <w:bCs/>
+        </w:rPr>
+        <w:t>∧</w:t>
+      </w:r>
+      <w:r>
+        <w:rPr>
+          <w:rFonts w:ascii="Cambria Math" w:hAnsi="Cambria Math" w:cs="Cambria Math"/>
+          <w:bCs/>
+        </w:rPr>
+        <w:t xml:space="preserve"> </w:t>
+      </w:r>
+      <w:r>
+        <w:rPr>
+          <w:bCs/>
+        </w:rPr>
+        <w:t>¬</w:t>
+      </w:r>
+      <w:r>
+        <w:rPr>
+          <w:bCs/>
+        </w:rPr>
+        <w:t xml:space="preserve">P) </w:t>
+      </w:r>
+      <w:r>
+        <w:rPr>
+          <w:b/>
+          <w:bCs/>
+        </w:rPr>
+        <w:t>→</w:t>
+      </w:r>
+      <w:r>
+        <w:rPr>
+          <w:b/>
+          <w:bCs/>
+        </w:rPr>
+        <w:t xml:space="preserve"> </w:t>
+      </w:r>
+      <w:r>
+        <w:rPr>
+          <w:bCs/>
+        </w:rPr>
+        <w:t>Q</w:t>
+      </w:r>
+    </w:p>
+    <w:p>
+      <w:pPr>
+        <w:rPr>
+          <w:bCs/>
+        </w:rPr>
+      </w:pPr>
+      <w:r>
+        <w:rPr>
+          <w:bCs/>
+        </w:rPr>
+        <w:t>modus ponendo tollens: (</w:t>
+      </w:r>
+      <w:r>
+        <w:rPr>
+          <w:bCs/>
+        </w:rPr>
+        <w:t>¬</w:t>
+      </w:r>
+      <w:r>
+        <w:rPr>
+          <w:bCs/>
+        </w:rPr>
+        <w:t xml:space="preserve">(P </w:t>
+      </w:r>
+      <w:r>
+        <w:rPr>
+          <w:rFonts w:ascii="Cambria Math" w:hAnsi="Cambria Math" w:cs="Cambria Math"/>
+          <w:bCs/>
+        </w:rPr>
+        <w:t>∧</w:t>
+      </w:r>
+      <w:r>
+        <w:rPr>
+          <w:rFonts w:ascii="Cambria Math" w:hAnsi="Cambria Math" w:cs="Cambria Math"/>
+          <w:bCs/>
+        </w:rPr>
+        <w:t xml:space="preserve"> Q) </w:t>
+      </w:r>
+      <w:r>
+        <w:rPr>
+          <w:rFonts w:ascii="Cambria Math" w:hAnsi="Cambria Math" w:cs="Cambria Math"/>
+          <w:bCs/>
+        </w:rPr>
+        <w:t>∧</w:t>
+      </w:r>
+      <w:r>
+        <w:rPr>
+          <w:rFonts w:ascii="Cambria Math" w:hAnsi="Cambria Math" w:cs="Cambria Math"/>
+          <w:bCs/>
+        </w:rPr>
+        <w:t xml:space="preserve"> P) </w:t>
+      </w:r>
+      <w:r>
+        <w:rPr>
+          <w:b/>
+          <w:bCs/>
+        </w:rPr>
+        <w:t>→</w:t>
+      </w:r>
+      <w:r>
+        <w:rPr>
+          <w:b/>
+          <w:bCs/>
+        </w:rPr>
+        <w:t xml:space="preserve"> </w:t>
+      </w:r>
+      <w:r>
+        <w:rPr>
+          <w:bCs/>
+        </w:rPr>
+        <w:t>¬</w:t>
+      </w:r>
+      <w:r>
+        <w:rPr>
+          <w:bCs/>
+        </w:rPr>
+        <w:t>Q</w:t>
+      </w:r>
+    </w:p>
+    <w:p>
+      <w:pPr>
+        <w:rPr>
+          <w:b/>
+        </w:rPr>
+      </w:pPr>
+      <w:r>
+        <w:rPr>
+          <w:b/>
+        </w:rPr>
+        <w:t>Exercise 35</w:t>
+      </w:r>
+    </w:p>
+    <w:tbl>
+      <w:tblPr>
+        <w:tblW w:w="11970" w:type="dxa"/>
+        <w:tblInd w:w="-1255" w:type="dxa"/>
+        <w:tblBorders>
+          <w:top w:val="single" w:sz="4" w:space="0" w:color="auto"/>
+          <w:left w:val="single" w:sz="4" w:space="0" w:color="auto"/>
+          <w:bottom w:val="single" w:sz="4" w:space="0" w:color="auto"/>
+          <w:right w:val="single" w:sz="4" w:space="0" w:color="auto"/>
+          <w:insideH w:val="single" w:sz="4" w:space="0" w:color="auto"/>
+          <w:insideV w:val="single" w:sz="4" w:space="0" w:color="auto"/>
+        </w:tblBorders>
+        <w:tblLayout w:type="fixed"/>
+        <w:tblCellMar>
+          <w:left w:w="0" w:type="dxa"/>
+          <w:right w:w="0" w:type="dxa"/>
+        </w:tblCellMar>
+        <w:tblLook w:val="04A0" w:firstRow="1" w:lastRow="0" w:firstColumn="1" w:lastColumn="0" w:noHBand="0" w:noVBand="1"/>
+      </w:tblPr>
+      <w:tblGrid>
+        <w:gridCol w:w="540"/>
+        <w:gridCol w:w="630"/>
+        <w:gridCol w:w="630"/>
+        <w:gridCol w:w="630"/>
+        <w:gridCol w:w="1080"/>
+        <w:gridCol w:w="990"/>
+        <w:gridCol w:w="990"/>
+        <w:gridCol w:w="1350"/>
+        <w:gridCol w:w="1800"/>
+        <w:gridCol w:w="1620"/>
+        <w:gridCol w:w="1710"/>
+      </w:tblGrid>
+      <w:tr>
+        <w:trPr>
+          <w:trHeight w:val="536"/>
+        </w:trPr>
+        <w:tc>
+          <w:tcPr>
+            <w:tcW w:w="540" w:type="dxa"/>
+            <w:vAlign w:val="center"/>
+          </w:tcPr>
+          <w:p>
+            <w:pPr>
+              <w:pStyle w:val="TableContents"/>
+              <w:jc w:val="center"/>
+              <w:rPr>
+                <w:color w:val="000000"/>
+                <w:sz w:val="22"/>
+                <w:szCs w:val="22"/>
+              </w:rPr>
+            </w:pPr>
+            <w:r>
+              <w:rPr>
+                <w:color w:val="000000"/>
+                <w:sz w:val="22"/>
+                <w:szCs w:val="22"/>
+              </w:rPr>
+              <w:t>A(</w:t>
+            </w:r>
+            <w:r>
+              <w:rPr>
+                <w:color w:val="000000"/>
+                <w:sz w:val="22"/>
+                <w:szCs w:val="22"/>
+              </w:rPr>
+              <w:t>P</w:t>
+            </w:r>
+            <w:r>
+              <w:rPr>
+                <w:color w:val="000000"/>
+                <w:sz w:val="22"/>
+                <w:szCs w:val="22"/>
+              </w:rPr>
+              <w:t>)</w:t>
+            </w:r>
+          </w:p>
+        </w:tc>
+        <w:tc>
+          <w:tcPr>
+            <w:tcW w:w="630" w:type="dxa"/>
+            <w:vAlign w:val="center"/>
+          </w:tcPr>
+          <w:p>
+            <w:pPr>
+              <w:pStyle w:val="TableContents"/>
+              <w:jc w:val="center"/>
+              <w:rPr>
+                <w:color w:val="000000"/>
+                <w:sz w:val="22"/>
+                <w:szCs w:val="22"/>
+              </w:rPr>
+            </w:pPr>
+            <w:r>
+              <w:rPr>
+                <w:color w:val="000000"/>
+                <w:sz w:val="22"/>
+                <w:szCs w:val="22"/>
+              </w:rPr>
+              <w:t>A(</w:t>
+            </w:r>
+            <w:r>
+              <w:rPr>
+                <w:color w:val="000000"/>
+                <w:sz w:val="22"/>
+                <w:szCs w:val="22"/>
+              </w:rPr>
+              <w:t>Q</w:t>
+            </w:r>
+            <w:r>
+              <w:rPr>
+                <w:color w:val="000000"/>
+                <w:sz w:val="22"/>
+                <w:szCs w:val="22"/>
+              </w:rPr>
+              <w:t>)</w:t>
+            </w:r>
+          </w:p>
+        </w:tc>
+        <w:tc>
+          <w:tcPr>
+            <w:tcW w:w="630" w:type="dxa"/>
+            <w:vAlign w:val="center"/>
+          </w:tcPr>
+          <w:p>
+            <w:pPr>
+              <w:pStyle w:val="TableContents"/>
+              <w:jc w:val="center"/>
+              <w:rPr>
+                <w:color w:val="000000"/>
+                <w:sz w:val="22"/>
+                <w:szCs w:val="22"/>
+              </w:rPr>
+            </w:pPr>
+            <w:r>
+              <w:rPr>
+                <w:color w:val="000000"/>
+                <w:sz w:val="22"/>
+                <w:szCs w:val="22"/>
+              </w:rPr>
+              <w:t>A(¬</w:t>
+            </w:r>
+            <w:r>
+              <w:rPr>
+                <w:color w:val="000000"/>
+                <w:sz w:val="22"/>
+                <w:szCs w:val="22"/>
+              </w:rPr>
+              <w:t>P</w:t>
+            </w:r>
+            <w:r>
+              <w:rPr>
+                <w:color w:val="000000"/>
+                <w:sz w:val="22"/>
+                <w:szCs w:val="22"/>
+              </w:rPr>
+              <w:t>)</w:t>
+            </w:r>
+          </w:p>
+        </w:tc>
+        <w:tc>
+          <w:tcPr>
+            <w:tcW w:w="630" w:type="dxa"/>
+            <w:vAlign w:val="center"/>
+          </w:tcPr>
+          <w:p>
+            <w:pPr>
+              <w:pStyle w:val="TableContents"/>
+              <w:jc w:val="center"/>
+              <w:rPr>
+                <w:color w:val="000000"/>
+                <w:sz w:val="22"/>
+                <w:szCs w:val="22"/>
+              </w:rPr>
+            </w:pPr>
+            <w:r>
+              <w:rPr>
+                <w:color w:val="000000"/>
+                <w:sz w:val="22"/>
+                <w:szCs w:val="22"/>
+              </w:rPr>
+              <w:t>A(¬</w:t>
+            </w:r>
+            <w:r>
+              <w:rPr>
+                <w:color w:val="000000"/>
+                <w:sz w:val="22"/>
+                <w:szCs w:val="22"/>
+              </w:rPr>
+              <w:t>Q</w:t>
+            </w:r>
+            <w:r>
+              <w:rPr>
+                <w:color w:val="000000"/>
+                <w:sz w:val="22"/>
+                <w:szCs w:val="22"/>
+              </w:rPr>
+              <w:t>)</w:t>
+            </w:r>
+          </w:p>
+        </w:tc>
+        <w:tc>
+          <w:tcPr>
+            <w:tcW w:w="1080" w:type="dxa"/>
+            <w:vAlign w:val="center"/>
+          </w:tcPr>
+          <w:p>
+            <w:pPr>
+              <w:pStyle w:val="TableContents"/>
+              <w:jc w:val="center"/>
+              <w:rPr>
+                <w:color w:val="000000"/>
+                <w:sz w:val="22"/>
+                <w:szCs w:val="22"/>
+              </w:rPr>
+            </w:pPr>
+            <w:r>
+              <w:rPr>
+                <w:color w:val="000000"/>
+                <w:sz w:val="22"/>
+                <w:szCs w:val="22"/>
+              </w:rPr>
+              <w:t>A(</w:t>
+            </w:r>
+            <w:r>
+              <w:rPr>
+                <w:bCs/>
+                <w:sz w:val="22"/>
+                <w:szCs w:val="22"/>
+              </w:rPr>
+              <w:t>P</w:t>
+            </w:r>
+            <w:r>
+              <w:rPr>
+                <w:b/>
+                <w:bCs/>
+                <w:sz w:val="22"/>
+                <w:szCs w:val="22"/>
+              </w:rPr>
+              <w:t xml:space="preserve"> → </w:t>
+            </w:r>
+            <w:r>
+              <w:rPr>
+                <w:bCs/>
+                <w:sz w:val="22"/>
+                <w:szCs w:val="22"/>
+              </w:rPr>
+              <w:t>Q</w:t>
+            </w:r>
+            <w:r>
+              <w:rPr>
+                <w:color w:val="000000"/>
+                <w:sz w:val="22"/>
+                <w:szCs w:val="22"/>
+              </w:rPr>
+              <w:t>)</w:t>
+            </w:r>
+          </w:p>
+        </w:tc>
+        <w:tc>
+          <w:tcPr>
+            <w:tcW w:w="990" w:type="dxa"/>
+            <w:vAlign w:val="center"/>
+          </w:tcPr>
+          <w:p>
+            <w:pPr>
+              <w:pStyle w:val="TableContents"/>
+              <w:jc w:val="center"/>
+              <w:rPr>
+                <w:color w:val="000000"/>
+                <w:sz w:val="22"/>
+                <w:szCs w:val="22"/>
+              </w:rPr>
+            </w:pPr>
+            <w:r>
+              <w:rPr>
+                <w:color w:val="000000"/>
+                <w:sz w:val="22"/>
+                <w:szCs w:val="22"/>
+              </w:rPr>
+              <w:t>A</w:t>
+            </w:r>
+            <w:r>
+              <w:rPr>
+                <w:bCs/>
+                <w:sz w:val="22"/>
+                <w:szCs w:val="22"/>
+              </w:rPr>
+              <w:t xml:space="preserve">(P </w:t>
+            </w:r>
+            <w:r>
+              <w:rPr>
+                <w:rFonts w:ascii="Cambria Math" w:hAnsi="Cambria Math" w:cs="Cambria Math"/>
+                <w:color w:val="000000"/>
+                <w:sz w:val="22"/>
+                <w:szCs w:val="22"/>
+              </w:rPr>
+              <w:t>∨</w:t>
+            </w:r>
+            <w:r>
+              <w:rPr>
+                <w:color w:val="000000"/>
+                <w:sz w:val="22"/>
+                <w:szCs w:val="22"/>
+              </w:rPr>
+              <w:t xml:space="preserve"> Q)</w:t>
+            </w:r>
+          </w:p>
+        </w:tc>
+        <w:tc>
+          <w:tcPr>
+            <w:tcW w:w="990" w:type="dxa"/>
+            <w:vAlign w:val="center"/>
+          </w:tcPr>
+          <w:p>
+            <w:pPr>
+              <w:pStyle w:val="TableContents"/>
+              <w:jc w:val="center"/>
+              <w:rPr>
+                <w:bCs/>
+                <w:sz w:val="22"/>
+                <w:szCs w:val="22"/>
+              </w:rPr>
+            </w:pPr>
+            <w:r>
+              <w:rPr>
+                <w:bCs/>
+                <w:sz w:val="22"/>
+                <w:szCs w:val="22"/>
+              </w:rPr>
+              <w:t>A</w:t>
+            </w:r>
+            <w:r>
+              <w:rPr>
+                <w:bCs/>
+                <w:sz w:val="22"/>
+                <w:szCs w:val="22"/>
+              </w:rPr>
+              <w:t xml:space="preserve">(P </w:t>
+            </w:r>
+            <w:r>
+              <w:rPr>
+                <w:rFonts w:ascii="Cambria Math" w:hAnsi="Cambria Math" w:cs="Cambria Math"/>
+                <w:bCs/>
+                <w:sz w:val="22"/>
+                <w:szCs w:val="22"/>
+              </w:rPr>
+              <w:t>∧</w:t>
+            </w:r>
+            <w:r>
+              <w:rPr>
+                <w:bCs/>
+                <w:sz w:val="22"/>
+                <w:szCs w:val="22"/>
+              </w:rPr>
+              <w:t xml:space="preserve"> Q)</w:t>
+            </w:r>
+          </w:p>
+        </w:tc>
+        <w:tc>
+          <w:tcPr>
+            <w:tcW w:w="1350" w:type="dxa"/>
+            <w:vAlign w:val="center"/>
+          </w:tcPr>
+          <w:p>
+            <w:pPr>
+              <w:pStyle w:val="TableContents"/>
+              <w:jc w:val="center"/>
+              <w:rPr>
+                <w:color w:val="000000"/>
+                <w:sz w:val="22"/>
+                <w:szCs w:val="22"/>
+              </w:rPr>
+            </w:pPr>
+            <w:r>
+              <w:rPr>
+                <w:bCs/>
+                <w:sz w:val="22"/>
+                <w:szCs w:val="22"/>
+              </w:rPr>
+              <w:t>A</w:t>
+            </w:r>
+            <w:r>
+              <w:rPr>
+                <w:bCs/>
+                <w:sz w:val="22"/>
+                <w:szCs w:val="22"/>
+              </w:rPr>
+              <w:t xml:space="preserve">(¬(P </w:t>
+            </w:r>
+            <w:r>
+              <w:rPr>
+                <w:rFonts w:ascii="Cambria Math" w:hAnsi="Cambria Math" w:cs="Cambria Math"/>
+                <w:bCs/>
+                <w:sz w:val="22"/>
+                <w:szCs w:val="22"/>
+              </w:rPr>
+              <w:t>∧</w:t>
+            </w:r>
+            <w:r>
+              <w:rPr>
+                <w:bCs/>
+                <w:sz w:val="22"/>
+                <w:szCs w:val="22"/>
+              </w:rPr>
+              <w:t xml:space="preserve"> Q</w:t>
+            </w:r>
+            <w:r>
+              <w:rPr>
+                <w:bCs/>
+                <w:sz w:val="22"/>
+                <w:szCs w:val="22"/>
+              </w:rPr>
+              <w:t>)</w:t>
+            </w:r>
+            <w:r>
+              <w:rPr>
+                <w:bCs/>
+                <w:sz w:val="22"/>
+                <w:szCs w:val="22"/>
+              </w:rPr>
+              <w:t>)</w:t>
+            </w:r>
+          </w:p>
+        </w:tc>
+        <w:tc>
+          <w:tcPr>
+            <w:tcW w:w="1800" w:type="dxa"/>
+            <w:vAlign w:val="center"/>
+          </w:tcPr>
+          <w:p>
+            <w:pPr>
+              <w:pStyle w:val="TableContents"/>
+              <w:jc w:val="center"/>
+              <w:rPr>
+                <w:bCs/>
+                <w:sz w:val="22"/>
+                <w:szCs w:val="22"/>
+              </w:rPr>
+            </w:pPr>
+            <w:r>
+              <w:rPr>
+                <w:color w:val="000000"/>
+                <w:sz w:val="22"/>
+                <w:szCs w:val="22"/>
+              </w:rPr>
+              <w:t>A</w:t>
+            </w:r>
+            <w:r>
+              <w:rPr>
+                <w:bCs/>
+                <w:sz w:val="22"/>
+                <w:szCs w:val="22"/>
+              </w:rPr>
+              <w:t>((P</w:t>
+            </w:r>
+            <w:r>
+              <w:rPr>
+                <w:b/>
+                <w:bCs/>
+                <w:sz w:val="22"/>
+                <w:szCs w:val="22"/>
+              </w:rPr>
+              <w:t xml:space="preserve"> → </w:t>
+            </w:r>
+            <w:r>
+              <w:rPr>
+                <w:bCs/>
+                <w:sz w:val="22"/>
+                <w:szCs w:val="22"/>
+              </w:rPr>
+              <w:t xml:space="preserve">Q) </w:t>
+            </w:r>
+            <w:r>
+              <w:rPr>
+                <w:rFonts w:ascii="Cambria Math" w:hAnsi="Cambria Math" w:cs="Cambria Math"/>
+                <w:bCs/>
+                <w:sz w:val="22"/>
+                <w:szCs w:val="22"/>
+              </w:rPr>
+              <w:t>∧</w:t>
+            </w:r>
+            <w:r>
+              <w:rPr>
+                <w:bCs/>
+                <w:sz w:val="22"/>
+                <w:szCs w:val="22"/>
+              </w:rPr>
+              <w:t xml:space="preserve"> ¬Q)</w:t>
+            </w:r>
+          </w:p>
+        </w:tc>
+        <w:tc>
+          <w:tcPr>
+            <w:tcW w:w="1620" w:type="dxa"/>
+            <w:vAlign w:val="center"/>
+          </w:tcPr>
+          <w:p>
+            <w:pPr>
+              <w:pStyle w:val="TableContents"/>
+              <w:jc w:val="center"/>
+              <w:rPr>
+                <w:bCs/>
+                <w:sz w:val="22"/>
+                <w:szCs w:val="22"/>
+              </w:rPr>
+            </w:pPr>
+            <w:r>
+              <w:rPr>
+                <w:color w:val="000000"/>
+                <w:sz w:val="22"/>
+                <w:szCs w:val="22"/>
+              </w:rPr>
+              <w:t>A</w:t>
+            </w:r>
+            <w:r>
+              <w:rPr>
+                <w:bCs/>
+                <w:sz w:val="22"/>
+                <w:szCs w:val="22"/>
+              </w:rPr>
+              <w:t xml:space="preserve">((P </w:t>
+            </w:r>
+            <w:r>
+              <w:rPr>
+                <w:rFonts w:ascii="Cambria Math" w:hAnsi="Cambria Math" w:cs="Cambria Math"/>
+                <w:color w:val="000000"/>
+                <w:sz w:val="22"/>
+                <w:szCs w:val="22"/>
+              </w:rPr>
+              <w:t>∨</w:t>
+            </w:r>
+            <w:r>
+              <w:rPr>
+                <w:color w:val="000000"/>
+                <w:sz w:val="22"/>
+                <w:szCs w:val="22"/>
+              </w:rPr>
+              <w:t xml:space="preserve"> Q) </w:t>
+            </w:r>
+            <w:r>
+              <w:rPr>
+                <w:rFonts w:ascii="Cambria Math" w:hAnsi="Cambria Math" w:cs="Cambria Math"/>
+                <w:bCs/>
+                <w:sz w:val="22"/>
+                <w:szCs w:val="22"/>
+              </w:rPr>
+              <w:t>∧</w:t>
+            </w:r>
+            <w:r>
+              <w:rPr>
+                <w:bCs/>
+                <w:sz w:val="22"/>
+                <w:szCs w:val="22"/>
+              </w:rPr>
+              <w:t xml:space="preserve"> ¬P)</w:t>
+            </w:r>
+          </w:p>
+        </w:tc>
+        <w:tc>
+          <w:tcPr>
+            <w:tcW w:w="1710" w:type="dxa"/>
+            <w:vAlign w:val="center"/>
+          </w:tcPr>
+          <w:p>
+            <w:pPr>
+              <w:pStyle w:val="TableContents"/>
+              <w:jc w:val="center"/>
+              <w:rPr>
+                <w:bCs/>
+                <w:sz w:val="22"/>
+                <w:szCs w:val="22"/>
+              </w:rPr>
+            </w:pPr>
+            <w:r>
+              <w:rPr>
+                <w:bCs/>
+                <w:sz w:val="22"/>
+                <w:szCs w:val="22"/>
+              </w:rPr>
+              <w:t xml:space="preserve">A(¬(P </w:t>
+            </w:r>
+            <w:r>
+              <w:rPr>
+                <w:rFonts w:ascii="Cambria Math" w:hAnsi="Cambria Math" w:cs="Cambria Math"/>
+                <w:bCs/>
+                <w:sz w:val="22"/>
+                <w:szCs w:val="22"/>
+              </w:rPr>
+              <w:t>∧</w:t>
+            </w:r>
+            <w:r>
+              <w:rPr>
+                <w:bCs/>
+                <w:sz w:val="22"/>
+                <w:szCs w:val="22"/>
+              </w:rPr>
+              <w:t xml:space="preserve"> Q) </w:t>
+            </w:r>
+            <w:r>
+              <w:rPr>
+                <w:rFonts w:ascii="Cambria Math" w:hAnsi="Cambria Math" w:cs="Cambria Math"/>
+                <w:bCs/>
+                <w:sz w:val="22"/>
+                <w:szCs w:val="22"/>
+              </w:rPr>
+              <w:t>∧</w:t>
+            </w:r>
+            <w:r>
+              <w:rPr>
+                <w:bCs/>
+                <w:sz w:val="22"/>
+                <w:szCs w:val="22"/>
+              </w:rPr>
+              <w:t xml:space="preserve"> P)</w:t>
+            </w:r>
+          </w:p>
+        </w:tc>
+      </w:tr>
+      <w:tr>
+        <w:trPr>
+          <w:trHeight w:val="523"/>
+        </w:trPr>
+        <w:tc>
+          <w:tcPr>
+            <w:tcW w:w="540" w:type="dxa"/>
+            <w:vAlign w:val="center"/>
+          </w:tcPr>
+          <w:p>
+            <w:pPr>
+              <w:pStyle w:val="TableContents"/>
+              <w:jc w:val="center"/>
+              <w:rPr>
+                <w:color w:val="000000"/>
+                <w:sz w:val="22"/>
+                <w:szCs w:val="22"/>
+              </w:rPr>
+            </w:pPr>
+            <w:r>
+              <w:rPr>
+                <w:color w:val="000000"/>
+                <w:sz w:val="22"/>
+                <w:szCs w:val="22"/>
+              </w:rPr>
+              <w:t>0</w:t>
+            </w:r>
+          </w:p>
+        </w:tc>
+        <w:tc>
+          <w:tcPr>
+            <w:tcW w:w="630" w:type="dxa"/>
+            <w:vAlign w:val="center"/>
+          </w:tcPr>
+          <w:p>
+            <w:pPr>
+              <w:pStyle w:val="TableContents"/>
+              <w:jc w:val="center"/>
+              <w:rPr>
+                <w:color w:val="000000"/>
+                <w:sz w:val="22"/>
+                <w:szCs w:val="22"/>
+              </w:rPr>
+            </w:pPr>
+            <w:r>
+              <w:rPr>
+                <w:color w:val="000000"/>
+                <w:sz w:val="22"/>
+                <w:szCs w:val="22"/>
+              </w:rPr>
+              <w:t>0</w:t>
+            </w:r>
+          </w:p>
+        </w:tc>
+        <w:tc>
+          <w:tcPr>
+            <w:tcW w:w="630" w:type="dxa"/>
+            <w:vAlign w:val="center"/>
+          </w:tcPr>
+          <w:p>
+            <w:pPr>
+              <w:pStyle w:val="TableContents"/>
+              <w:jc w:val="center"/>
+              <w:rPr>
+                <w:color w:val="000000"/>
+                <w:sz w:val="22"/>
+                <w:szCs w:val="22"/>
+              </w:rPr>
+            </w:pPr>
+            <w:r>
+              <w:rPr>
+                <w:color w:val="000000"/>
+                <w:sz w:val="22"/>
+                <w:szCs w:val="22"/>
+              </w:rPr>
+              <w:t>1</w:t>
+            </w:r>
+          </w:p>
+        </w:tc>
+        <w:tc>
+          <w:tcPr>
+            <w:tcW w:w="630" w:type="dxa"/>
+            <w:vAlign w:val="center"/>
+          </w:tcPr>
+          <w:p>
+            <w:pPr>
+              <w:pStyle w:val="TableContents"/>
+              <w:jc w:val="center"/>
+              <w:rPr>
+                <w:color w:val="000000"/>
+                <w:sz w:val="22"/>
+                <w:szCs w:val="22"/>
+              </w:rPr>
+            </w:pPr>
+            <w:r>
+              <w:rPr>
+                <w:color w:val="000000"/>
+                <w:sz w:val="22"/>
+                <w:szCs w:val="22"/>
+              </w:rPr>
+              <w:t>1</w:t>
+            </w:r>
+          </w:p>
+        </w:tc>
+        <w:tc>
+          <w:tcPr>
+            <w:tcW w:w="1080" w:type="dxa"/>
+            <w:vAlign w:val="center"/>
+          </w:tcPr>
+          <w:p>
+            <w:pPr>
+              <w:pStyle w:val="TableContents"/>
+              <w:jc w:val="center"/>
+              <w:rPr>
+                <w:color w:val="000000"/>
+                <w:sz w:val="22"/>
+                <w:szCs w:val="22"/>
+              </w:rPr>
+            </w:pPr>
+            <w:r>
+              <w:rPr>
+                <w:color w:val="000000"/>
+                <w:sz w:val="22"/>
+                <w:szCs w:val="22"/>
+              </w:rPr>
+              <w:t>1</w:t>
+            </w:r>
+          </w:p>
+        </w:tc>
+        <w:tc>
+          <w:tcPr>
+            <w:tcW w:w="990" w:type="dxa"/>
+            <w:vAlign w:val="center"/>
+          </w:tcPr>
+          <w:p>
+            <w:pPr>
+              <w:pStyle w:val="TableContents"/>
+              <w:jc w:val="center"/>
+              <w:rPr>
+                <w:color w:val="000000"/>
+                <w:sz w:val="22"/>
+                <w:szCs w:val="22"/>
+              </w:rPr>
+            </w:pPr>
+            <w:r>
+              <w:rPr>
+                <w:color w:val="000000"/>
+                <w:sz w:val="22"/>
+                <w:szCs w:val="22"/>
+              </w:rPr>
+              <w:t>0</w:t>
+            </w:r>
+          </w:p>
+        </w:tc>
+        <w:tc>
+          <w:tcPr>
+            <w:tcW w:w="990" w:type="dxa"/>
+            <w:vAlign w:val="center"/>
+          </w:tcPr>
+          <w:p>
+            <w:pPr>
+              <w:pStyle w:val="TableContents"/>
+              <w:jc w:val="center"/>
+              <w:rPr>
+                <w:color w:val="000000"/>
+                <w:sz w:val="22"/>
+                <w:szCs w:val="22"/>
+              </w:rPr>
+            </w:pPr>
+            <w:r>
+              <w:rPr>
+                <w:color w:val="000000"/>
+                <w:sz w:val="22"/>
+                <w:szCs w:val="22"/>
+              </w:rPr>
+              <w:t>0</w:t>
+            </w:r>
+          </w:p>
+        </w:tc>
+        <w:tc>
+          <w:tcPr>
+            <w:tcW w:w="1350" w:type="dxa"/>
+            <w:vAlign w:val="center"/>
+          </w:tcPr>
+          <w:p>
+            <w:pPr>
+              <w:pStyle w:val="TableContents"/>
+              <w:jc w:val="center"/>
+              <w:rPr>
+                <w:color w:val="000000"/>
+                <w:sz w:val="22"/>
+                <w:szCs w:val="22"/>
+              </w:rPr>
+            </w:pPr>
+            <w:r>
+              <w:rPr>
+                <w:color w:val="000000"/>
+                <w:sz w:val="22"/>
+                <w:szCs w:val="22"/>
+              </w:rPr>
+              <w:t>1</w:t>
+            </w:r>
+          </w:p>
+        </w:tc>
+        <w:tc>
+          <w:tcPr>
+            <w:tcW w:w="1800" w:type="dxa"/>
+            <w:vAlign w:val="center"/>
+          </w:tcPr>
+          <w:p>
+            <w:pPr>
+              <w:pStyle w:val="TableContents"/>
+              <w:jc w:val="center"/>
+              <w:rPr>
+                <w:color w:val="000000"/>
+                <w:sz w:val="22"/>
+                <w:szCs w:val="22"/>
+              </w:rPr>
+            </w:pPr>
+            <w:r>
+              <w:rPr>
+                <w:color w:val="000000"/>
+                <w:sz w:val="22"/>
+                <w:szCs w:val="22"/>
+              </w:rPr>
+              <w:t>1</w:t>
+            </w:r>
+          </w:p>
+        </w:tc>
+        <w:tc>
+          <w:tcPr>
+            <w:tcW w:w="1620" w:type="dxa"/>
+            <w:vAlign w:val="center"/>
+          </w:tcPr>
+          <w:p>
+            <w:pPr>
+              <w:pStyle w:val="TableContents"/>
+              <w:jc w:val="center"/>
+              <w:rPr>
+                <w:color w:val="000000"/>
+                <w:sz w:val="22"/>
+                <w:szCs w:val="22"/>
+              </w:rPr>
+            </w:pPr>
+            <w:r>
+              <w:rPr>
+                <w:color w:val="000000"/>
+                <w:sz w:val="22"/>
+                <w:szCs w:val="22"/>
+              </w:rPr>
+              <w:t>1</w:t>
+            </w:r>
+          </w:p>
+        </w:tc>
+        <w:tc>
+          <w:tcPr>
+            <w:tcW w:w="1710" w:type="dxa"/>
+            <w:vAlign w:val="center"/>
+          </w:tcPr>
+          <w:p>
+            <w:pPr>
+              <w:pStyle w:val="TableContents"/>
+              <w:jc w:val="center"/>
+              <w:rPr>
+                <w:color w:val="000000"/>
+                <w:sz w:val="22"/>
+                <w:szCs w:val="22"/>
+              </w:rPr>
+            </w:pPr>
+            <w:r>
+              <w:rPr>
+                <w:bCs/>
+                <w:sz w:val="22"/>
+                <w:szCs w:val="22"/>
+              </w:rPr>
+              <w:t>0</w:t>
+            </w:r>
+          </w:p>
+        </w:tc>
+      </w:tr>
+      <w:tr>
+        <w:trPr>
+          <w:trHeight w:val="523"/>
+        </w:trPr>
+        <w:tc>
+          <w:tcPr>
+            <w:tcW w:w="540" w:type="dxa"/>
+            <w:vAlign w:val="center"/>
+          </w:tcPr>
+          <w:p>
+            <w:pPr>
+              <w:pStyle w:val="TableContents"/>
+              <w:jc w:val="center"/>
+              <w:rPr>
+                <w:color w:val="000000"/>
+                <w:sz w:val="22"/>
+                <w:szCs w:val="22"/>
+              </w:rPr>
+            </w:pPr>
+            <w:r>
+              <w:rPr>
+                <w:color w:val="000000"/>
+                <w:sz w:val="22"/>
+                <w:szCs w:val="22"/>
+              </w:rPr>
+              <w:t>0</w:t>
+            </w:r>
+          </w:p>
+        </w:tc>
+        <w:tc>
+          <w:tcPr>
+            <w:tcW w:w="630" w:type="dxa"/>
+            <w:vAlign w:val="center"/>
+          </w:tcPr>
+          <w:p>
+            <w:pPr>
+              <w:pStyle w:val="TableContents"/>
+              <w:jc w:val="center"/>
+              <w:rPr>
+                <w:color w:val="000000"/>
+                <w:sz w:val="22"/>
+                <w:szCs w:val="22"/>
+              </w:rPr>
+            </w:pPr>
+            <w:r>
+              <w:rPr>
+                <w:color w:val="000000"/>
+                <w:sz w:val="22"/>
+                <w:szCs w:val="22"/>
+              </w:rPr>
+              <w:t>1</w:t>
+            </w:r>
+          </w:p>
+        </w:tc>
+        <w:tc>
+          <w:tcPr>
+            <w:tcW w:w="630" w:type="dxa"/>
+            <w:vAlign w:val="center"/>
+          </w:tcPr>
+          <w:p>
+            <w:pPr>
+              <w:pStyle w:val="TableContents"/>
+              <w:jc w:val="center"/>
+              <w:rPr>
+                <w:color w:val="000000"/>
+                <w:sz w:val="22"/>
+                <w:szCs w:val="22"/>
+              </w:rPr>
+            </w:pPr>
+            <w:r>
+              <w:rPr>
+                <w:color w:val="000000"/>
+                <w:sz w:val="22"/>
+                <w:szCs w:val="22"/>
+              </w:rPr>
+              <w:t>1</w:t>
+            </w:r>
+          </w:p>
+        </w:tc>
+        <w:tc>
+          <w:tcPr>
+            <w:tcW w:w="630" w:type="dxa"/>
+            <w:vAlign w:val="center"/>
+          </w:tcPr>
+          <w:p>
+            <w:pPr>
+              <w:pStyle w:val="TableContents"/>
+              <w:jc w:val="center"/>
+              <w:rPr>
+                <w:color w:val="000000"/>
+                <w:sz w:val="22"/>
+                <w:szCs w:val="22"/>
+              </w:rPr>
+            </w:pPr>
+            <w:r>
+              <w:rPr>
+                <w:color w:val="000000"/>
+                <w:sz w:val="22"/>
+                <w:szCs w:val="22"/>
+              </w:rPr>
+              <w:t>0</w:t>
+            </w:r>
+          </w:p>
+        </w:tc>
+        <w:tc>
+          <w:tcPr>
+            <w:tcW w:w="1080" w:type="dxa"/>
+            <w:vAlign w:val="center"/>
+          </w:tcPr>
+          <w:p>
+            <w:pPr>
+              <w:pStyle w:val="TableContents"/>
+              <w:jc w:val="center"/>
+              <w:rPr>
+                <w:color w:val="000000"/>
+                <w:sz w:val="22"/>
+                <w:szCs w:val="22"/>
+              </w:rPr>
+            </w:pPr>
+            <w:r>
+              <w:rPr>
+                <w:color w:val="000000"/>
+                <w:sz w:val="22"/>
+                <w:szCs w:val="22"/>
+              </w:rPr>
+              <w:t>1</w:t>
+            </w:r>
+          </w:p>
+        </w:tc>
+        <w:tc>
+          <w:tcPr>
+            <w:tcW w:w="990" w:type="dxa"/>
+            <w:vAlign w:val="center"/>
+          </w:tcPr>
+          <w:p>
+            <w:pPr>
+              <w:pStyle w:val="TableContents"/>
+              <w:jc w:val="center"/>
+              <w:rPr>
+                <w:color w:val="000000"/>
+                <w:sz w:val="22"/>
+                <w:szCs w:val="22"/>
+              </w:rPr>
+            </w:pPr>
+            <w:r>
+              <w:rPr>
+                <w:color w:val="000000"/>
+                <w:sz w:val="22"/>
+                <w:szCs w:val="22"/>
+              </w:rPr>
+              <w:t>1</w:t>
+            </w:r>
+          </w:p>
+        </w:tc>
+        <w:tc>
+          <w:tcPr>
+            <w:tcW w:w="990" w:type="dxa"/>
+            <w:vAlign w:val="center"/>
+          </w:tcPr>
+          <w:p>
+            <w:pPr>
+              <w:pStyle w:val="TableContents"/>
+              <w:jc w:val="center"/>
+              <w:rPr>
+                <w:color w:val="000000"/>
+                <w:sz w:val="22"/>
+                <w:szCs w:val="22"/>
+              </w:rPr>
+            </w:pPr>
+            <w:r>
+              <w:rPr>
+                <w:color w:val="000000"/>
+                <w:sz w:val="22"/>
+                <w:szCs w:val="22"/>
+              </w:rPr>
+              <w:t>0</w:t>
+            </w:r>
+          </w:p>
+        </w:tc>
+        <w:tc>
+          <w:tcPr>
+            <w:tcW w:w="1350" w:type="dxa"/>
+            <w:vAlign w:val="center"/>
+          </w:tcPr>
+          <w:p>
+            <w:pPr>
+              <w:pStyle w:val="TableContents"/>
+              <w:jc w:val="center"/>
+              <w:rPr>
+                <w:color w:val="000000"/>
+                <w:sz w:val="22"/>
+                <w:szCs w:val="22"/>
+              </w:rPr>
+            </w:pPr>
+            <w:r>
+              <w:rPr>
+                <w:color w:val="000000"/>
+                <w:sz w:val="22"/>
+                <w:szCs w:val="22"/>
+              </w:rPr>
+              <w:t>1</w:t>
+            </w:r>
+          </w:p>
+        </w:tc>
+        <w:tc>
+          <w:tcPr>
+            <w:tcW w:w="1800" w:type="dxa"/>
+            <w:vAlign w:val="center"/>
+          </w:tcPr>
+          <w:p>
+            <w:pPr>
+              <w:pStyle w:val="TableContents"/>
+              <w:jc w:val="center"/>
+              <w:rPr>
+                <w:color w:val="000000"/>
+                <w:sz w:val="22"/>
+                <w:szCs w:val="22"/>
+              </w:rPr>
+            </w:pPr>
+            <w:r>
+              <w:rPr>
+                <w:color w:val="000000"/>
+                <w:sz w:val="22"/>
+                <w:szCs w:val="22"/>
+              </w:rPr>
+              <w:t>0</w:t>
+            </w:r>
+          </w:p>
+        </w:tc>
+        <w:tc>
+          <w:tcPr>
+            <w:tcW w:w="1620" w:type="dxa"/>
+            <w:vAlign w:val="center"/>
+          </w:tcPr>
+          <w:p>
+            <w:pPr>
+              <w:pStyle w:val="TableContents"/>
+              <w:jc w:val="center"/>
+              <w:rPr>
+                <w:color w:val="000000"/>
+                <w:sz w:val="22"/>
+                <w:szCs w:val="22"/>
+              </w:rPr>
+            </w:pPr>
+            <w:r>
+              <w:rPr>
+                <w:bCs/>
+                <w:sz w:val="22"/>
+                <w:szCs w:val="22"/>
+              </w:rPr>
+              <w:t>1</w:t>
+            </w:r>
+          </w:p>
+        </w:tc>
+        <w:tc>
+          <w:tcPr>
+            <w:tcW w:w="1710" w:type="dxa"/>
+            <w:vAlign w:val="center"/>
+          </w:tcPr>
+          <w:p>
+            <w:pPr>
+              <w:pStyle w:val="TableContents"/>
+              <w:jc w:val="center"/>
+              <w:rPr>
+                <w:color w:val="000000"/>
+                <w:sz w:val="22"/>
+                <w:szCs w:val="22"/>
+              </w:rPr>
+            </w:pPr>
+            <w:r>
+              <w:rPr>
+                <w:bCs/>
+                <w:sz w:val="22"/>
+                <w:szCs w:val="22"/>
+              </w:rPr>
+              <w:t>0</w:t>
+            </w:r>
+          </w:p>
+        </w:tc>
+      </w:tr>
+      <w:tr>
+        <w:trPr>
+          <w:trHeight w:val="523"/>
+        </w:trPr>
+        <w:tc>
+          <w:tcPr>
+            <w:tcW w:w="540" w:type="dxa"/>
+            <w:vAlign w:val="center"/>
+          </w:tcPr>
+          <w:p>
+            <w:pPr>
+              <w:pStyle w:val="TableContents"/>
+              <w:jc w:val="center"/>
+              <w:rPr>
+                <w:color w:val="000000"/>
+                <w:sz w:val="22"/>
+                <w:szCs w:val="22"/>
+              </w:rPr>
+            </w:pPr>
+            <w:r>
+              <w:rPr>
+                <w:color w:val="000000"/>
+                <w:sz w:val="22"/>
+                <w:szCs w:val="22"/>
+              </w:rPr>
+              <w:t>1</w:t>
+            </w:r>
+          </w:p>
+        </w:tc>
+        <w:tc>
+          <w:tcPr>
+            <w:tcW w:w="630" w:type="dxa"/>
+            <w:vAlign w:val="center"/>
+          </w:tcPr>
+          <w:p>
+            <w:pPr>
+              <w:pStyle w:val="TableContents"/>
+              <w:jc w:val="center"/>
+              <w:rPr>
+                <w:color w:val="000000"/>
+                <w:sz w:val="22"/>
+                <w:szCs w:val="22"/>
+              </w:rPr>
+            </w:pPr>
+            <w:r>
+              <w:rPr>
+                <w:color w:val="000000"/>
+                <w:sz w:val="22"/>
+                <w:szCs w:val="22"/>
+              </w:rPr>
+              <w:t>0</w:t>
+            </w:r>
+          </w:p>
+        </w:tc>
+        <w:tc>
+          <w:tcPr>
+            <w:tcW w:w="630" w:type="dxa"/>
+            <w:vAlign w:val="center"/>
+          </w:tcPr>
+          <w:p>
+            <w:pPr>
+              <w:pStyle w:val="TableContents"/>
+              <w:jc w:val="center"/>
+              <w:rPr>
+                <w:color w:val="000000"/>
+                <w:sz w:val="22"/>
+                <w:szCs w:val="22"/>
+              </w:rPr>
+            </w:pPr>
+            <w:r>
+              <w:rPr>
+                <w:color w:val="000000"/>
+                <w:sz w:val="22"/>
+                <w:szCs w:val="22"/>
+              </w:rPr>
+              <w:t>0</w:t>
+            </w:r>
+          </w:p>
+        </w:tc>
+        <w:tc>
+          <w:tcPr>
+            <w:tcW w:w="630" w:type="dxa"/>
+            <w:vAlign w:val="center"/>
+          </w:tcPr>
+          <w:p>
+            <w:pPr>
+              <w:pStyle w:val="TableContents"/>
+              <w:jc w:val="center"/>
+              <w:rPr>
+                <w:color w:val="000000"/>
+                <w:sz w:val="22"/>
+                <w:szCs w:val="22"/>
+              </w:rPr>
+            </w:pPr>
+            <w:r>
+              <w:rPr>
+                <w:color w:val="000000"/>
+                <w:sz w:val="22"/>
+                <w:szCs w:val="22"/>
+              </w:rPr>
+              <w:t>1</w:t>
+            </w:r>
+          </w:p>
+        </w:tc>
+        <w:tc>
+          <w:tcPr>
+            <w:tcW w:w="1080" w:type="dxa"/>
+            <w:vAlign w:val="center"/>
+          </w:tcPr>
+          <w:p>
+            <w:pPr>
+              <w:pStyle w:val="TableContents"/>
+              <w:jc w:val="center"/>
+              <w:rPr>
+                <w:color w:val="000000"/>
+                <w:sz w:val="22"/>
+                <w:szCs w:val="22"/>
+              </w:rPr>
+            </w:pPr>
+            <w:r>
+              <w:rPr>
+                <w:color w:val="000000"/>
+                <w:sz w:val="22"/>
+                <w:szCs w:val="22"/>
+              </w:rPr>
+              <w:t>0</w:t>
+            </w:r>
+          </w:p>
+        </w:tc>
+        <w:tc>
+          <w:tcPr>
+            <w:tcW w:w="990" w:type="dxa"/>
+            <w:vAlign w:val="center"/>
+          </w:tcPr>
+          <w:p>
+            <w:pPr>
+              <w:pStyle w:val="TableContents"/>
+              <w:jc w:val="center"/>
+              <w:rPr>
+                <w:color w:val="000000"/>
+                <w:sz w:val="22"/>
+                <w:szCs w:val="22"/>
+              </w:rPr>
+            </w:pPr>
+            <w:r>
+              <w:rPr>
+                <w:color w:val="000000"/>
+                <w:sz w:val="22"/>
+                <w:szCs w:val="22"/>
+              </w:rPr>
+              <w:t>1</w:t>
+            </w:r>
+          </w:p>
+        </w:tc>
+        <w:tc>
+          <w:tcPr>
+            <w:tcW w:w="990" w:type="dxa"/>
+            <w:vAlign w:val="center"/>
+          </w:tcPr>
+          <w:p>
+            <w:pPr>
+              <w:pStyle w:val="TableContents"/>
+              <w:jc w:val="center"/>
+              <w:rPr>
+                <w:color w:val="000000"/>
+                <w:sz w:val="22"/>
+                <w:szCs w:val="22"/>
+              </w:rPr>
+            </w:pPr>
+            <w:r>
+              <w:rPr>
+                <w:color w:val="000000"/>
+                <w:sz w:val="22"/>
+                <w:szCs w:val="22"/>
+              </w:rPr>
+              <w:t>0</w:t>
+            </w:r>
+          </w:p>
+        </w:tc>
+        <w:tc>
+          <w:tcPr>
+            <w:tcW w:w="1350" w:type="dxa"/>
+            <w:vAlign w:val="center"/>
+          </w:tcPr>
+          <w:p>
+            <w:pPr>
+              <w:pStyle w:val="TableContents"/>
+              <w:jc w:val="center"/>
+              <w:rPr>
+                <w:color w:val="000000"/>
+                <w:sz w:val="22"/>
+                <w:szCs w:val="22"/>
+              </w:rPr>
+            </w:pPr>
+            <w:r>
+              <w:rPr>
+                <w:color w:val="000000"/>
+                <w:sz w:val="22"/>
+                <w:szCs w:val="22"/>
+              </w:rPr>
+              <w:t>1</w:t>
+            </w:r>
+          </w:p>
+        </w:tc>
+        <w:tc>
+          <w:tcPr>
+            <w:tcW w:w="1800" w:type="dxa"/>
+            <w:vAlign w:val="center"/>
+          </w:tcPr>
+          <w:p>
+            <w:pPr>
+              <w:pStyle w:val="TableContents"/>
+              <w:jc w:val="center"/>
+              <w:rPr>
+                <w:color w:val="000000"/>
+                <w:sz w:val="22"/>
+                <w:szCs w:val="22"/>
+              </w:rPr>
+            </w:pPr>
+            <w:r>
+              <w:rPr>
+                <w:color w:val="000000"/>
+                <w:sz w:val="22"/>
+                <w:szCs w:val="22"/>
+              </w:rPr>
+              <w:t>0</w:t>
+            </w:r>
+          </w:p>
+        </w:tc>
+        <w:tc>
+          <w:tcPr>
+            <w:tcW w:w="1620" w:type="dxa"/>
+            <w:vAlign w:val="center"/>
+          </w:tcPr>
+          <w:p>
+            <w:pPr>
+              <w:pStyle w:val="TableContents"/>
+              <w:jc w:val="center"/>
+              <w:rPr>
+                <w:color w:val="000000"/>
+                <w:sz w:val="22"/>
+                <w:szCs w:val="22"/>
+              </w:rPr>
+            </w:pPr>
+            <w:r>
+              <w:rPr>
+                <w:bCs/>
+                <w:sz w:val="22"/>
+                <w:szCs w:val="22"/>
+              </w:rPr>
+              <w:t>0</w:t>
+            </w:r>
+          </w:p>
+        </w:tc>
+        <w:tc>
+          <w:tcPr>
+            <w:tcW w:w="1710" w:type="dxa"/>
+            <w:vAlign w:val="center"/>
+          </w:tcPr>
+          <w:p>
+            <w:pPr>
+              <w:pStyle w:val="TableContents"/>
+              <w:jc w:val="center"/>
+              <w:rPr>
+                <w:color w:val="000000"/>
+                <w:sz w:val="22"/>
+                <w:szCs w:val="22"/>
+              </w:rPr>
+            </w:pPr>
+            <w:r>
+              <w:rPr>
+                <w:bCs/>
+                <w:sz w:val="22"/>
+                <w:szCs w:val="22"/>
+              </w:rPr>
+              <w:t>1</w:t>
+            </w:r>
+          </w:p>
+        </w:tc>
+      </w:tr>
+      <w:tr>
+        <w:trPr>
+          <w:trHeight w:val="523"/>
+        </w:trPr>
+        <w:tc>
+          <w:tcPr>
+            <w:tcW w:w="540" w:type="dxa"/>
+            <w:vAlign w:val="center"/>
+          </w:tcPr>
+          <w:p>
+            <w:pPr>
+              <w:pStyle w:val="TableContents"/>
+              <w:jc w:val="center"/>
+              <w:rPr>
+                <w:color w:val="000000"/>
+                <w:sz w:val="22"/>
+                <w:szCs w:val="22"/>
+              </w:rPr>
+            </w:pPr>
+            <w:r>
+              <w:rPr>
+                <w:color w:val="000000"/>
+                <w:sz w:val="22"/>
+                <w:szCs w:val="22"/>
+              </w:rPr>
+              <w:t>1</w:t>
+            </w:r>
+          </w:p>
+        </w:tc>
+        <w:tc>
+          <w:tcPr>
+            <w:tcW w:w="630" w:type="dxa"/>
+            <w:vAlign w:val="center"/>
+          </w:tcPr>
+          <w:p>
+            <w:pPr>
+              <w:pStyle w:val="TableContents"/>
+              <w:jc w:val="center"/>
+              <w:rPr>
+                <w:color w:val="000000"/>
+                <w:sz w:val="22"/>
+                <w:szCs w:val="22"/>
+              </w:rPr>
+            </w:pPr>
+            <w:r>
+              <w:rPr>
+                <w:color w:val="000000"/>
+                <w:sz w:val="22"/>
+                <w:szCs w:val="22"/>
+              </w:rPr>
+              <w:t>1</w:t>
+            </w:r>
+          </w:p>
+        </w:tc>
+        <w:tc>
+          <w:tcPr>
+            <w:tcW w:w="630" w:type="dxa"/>
+            <w:vAlign w:val="center"/>
+          </w:tcPr>
+          <w:p>
+            <w:pPr>
+              <w:pStyle w:val="TableContents"/>
+              <w:jc w:val="center"/>
+              <w:rPr>
+                <w:color w:val="000000"/>
+                <w:sz w:val="22"/>
+                <w:szCs w:val="22"/>
+              </w:rPr>
+            </w:pPr>
+            <w:r>
+              <w:rPr>
+                <w:color w:val="000000"/>
+                <w:sz w:val="22"/>
+                <w:szCs w:val="22"/>
+              </w:rPr>
+              <w:t>0</w:t>
+            </w:r>
+          </w:p>
+        </w:tc>
+        <w:tc>
+          <w:tcPr>
+            <w:tcW w:w="630" w:type="dxa"/>
+            <w:vAlign w:val="center"/>
+          </w:tcPr>
+          <w:p>
+            <w:pPr>
+              <w:pStyle w:val="TableContents"/>
+              <w:jc w:val="center"/>
+              <w:rPr>
+                <w:color w:val="000000"/>
+                <w:sz w:val="22"/>
+                <w:szCs w:val="22"/>
+              </w:rPr>
+            </w:pPr>
+            <w:r>
+              <w:rPr>
+                <w:color w:val="000000"/>
+                <w:sz w:val="22"/>
+                <w:szCs w:val="22"/>
+              </w:rPr>
+              <w:t>0</w:t>
+            </w:r>
+          </w:p>
+        </w:tc>
+        <w:tc>
+          <w:tcPr>
+            <w:tcW w:w="1080" w:type="dxa"/>
+            <w:vAlign w:val="center"/>
+          </w:tcPr>
+          <w:p>
+            <w:pPr>
+              <w:pStyle w:val="TableContents"/>
+              <w:jc w:val="center"/>
+              <w:rPr>
+                <w:color w:val="000000"/>
+                <w:sz w:val="22"/>
+                <w:szCs w:val="22"/>
+              </w:rPr>
+            </w:pPr>
+            <w:r>
+              <w:rPr>
+                <w:color w:val="000000"/>
+                <w:sz w:val="22"/>
+                <w:szCs w:val="22"/>
+              </w:rPr>
+              <w:t>1</w:t>
+            </w:r>
+          </w:p>
+        </w:tc>
+        <w:tc>
+          <w:tcPr>
+            <w:tcW w:w="990" w:type="dxa"/>
+            <w:vAlign w:val="center"/>
+          </w:tcPr>
+          <w:p>
+            <w:pPr>
+              <w:pStyle w:val="TableContents"/>
+              <w:jc w:val="center"/>
+              <w:rPr>
+                <w:color w:val="000000"/>
+                <w:sz w:val="22"/>
+                <w:szCs w:val="22"/>
+              </w:rPr>
+            </w:pPr>
+            <w:r>
+              <w:rPr>
+                <w:color w:val="000000"/>
+                <w:sz w:val="22"/>
+                <w:szCs w:val="22"/>
+              </w:rPr>
+              <w:t>1</w:t>
+            </w:r>
+          </w:p>
+        </w:tc>
+        <w:tc>
+          <w:tcPr>
+            <w:tcW w:w="990" w:type="dxa"/>
+            <w:vAlign w:val="center"/>
+          </w:tcPr>
+          <w:p>
+            <w:pPr>
+              <w:pStyle w:val="TableContents"/>
+              <w:jc w:val="center"/>
+              <w:rPr>
+                <w:color w:val="000000"/>
+                <w:sz w:val="22"/>
+                <w:szCs w:val="22"/>
+              </w:rPr>
+            </w:pPr>
+            <w:r>
+              <w:rPr>
+                <w:color w:val="000000"/>
+                <w:sz w:val="22"/>
+                <w:szCs w:val="22"/>
+              </w:rPr>
+              <w:t>1</w:t>
+            </w:r>
+          </w:p>
+        </w:tc>
+        <w:tc>
+          <w:tcPr>
+            <w:tcW w:w="1350" w:type="dxa"/>
+            <w:vAlign w:val="center"/>
+          </w:tcPr>
+          <w:p>
+            <w:pPr>
+              <w:pStyle w:val="TableContents"/>
+              <w:jc w:val="center"/>
+              <w:rPr>
+                <w:color w:val="000000"/>
+                <w:sz w:val="22"/>
+                <w:szCs w:val="22"/>
+              </w:rPr>
+            </w:pPr>
+            <w:r>
+              <w:rPr>
+                <w:color w:val="000000"/>
+                <w:sz w:val="22"/>
+                <w:szCs w:val="22"/>
+              </w:rPr>
+              <w:t>0</w:t>
+            </w:r>
+          </w:p>
+        </w:tc>
+        <w:tc>
+          <w:tcPr>
+            <w:tcW w:w="1800" w:type="dxa"/>
+            <w:vAlign w:val="center"/>
+          </w:tcPr>
+          <w:p>
+            <w:pPr>
+              <w:pStyle w:val="TableContents"/>
+              <w:jc w:val="center"/>
+              <w:rPr>
+                <w:color w:val="000000"/>
+                <w:sz w:val="22"/>
+                <w:szCs w:val="22"/>
+              </w:rPr>
+            </w:pPr>
+            <w:r>
+              <w:rPr>
+                <w:color w:val="000000"/>
+                <w:sz w:val="22"/>
+                <w:szCs w:val="22"/>
+              </w:rPr>
+              <w:t>0</w:t>
+            </w:r>
+          </w:p>
+        </w:tc>
+        <w:tc>
+          <w:tcPr>
+            <w:tcW w:w="1620" w:type="dxa"/>
+            <w:vAlign w:val="center"/>
+          </w:tcPr>
+          <w:p>
+            <w:pPr>
+              <w:pStyle w:val="TableContents"/>
+              <w:jc w:val="center"/>
+              <w:rPr>
+                <w:color w:val="000000"/>
+                <w:sz w:val="22"/>
+                <w:szCs w:val="22"/>
+              </w:rPr>
+            </w:pPr>
+            <w:r>
+              <w:rPr>
+                <w:bCs/>
+                <w:sz w:val="22"/>
+                <w:szCs w:val="22"/>
+              </w:rPr>
+              <w:t>0</w:t>
+            </w:r>
+          </w:p>
+        </w:tc>
+        <w:tc>
+          <w:tcPr>
+            <w:tcW w:w="1710" w:type="dxa"/>
+            <w:vAlign w:val="center"/>
+          </w:tcPr>
+          <w:p>
+            <w:pPr>
+              <w:pStyle w:val="TableContents"/>
+              <w:jc w:val="center"/>
+              <w:rPr>
+                <w:color w:val="000000"/>
+                <w:sz w:val="22"/>
+                <w:szCs w:val="22"/>
+              </w:rPr>
+            </w:pPr>
+            <w:r>
+              <w:rPr>
+                <w:bCs/>
+                <w:sz w:val="22"/>
+                <w:szCs w:val="22"/>
+              </w:rPr>
+              <w:t>0</w:t>
+            </w:r>
+          </w:p>
+        </w:tc>
+      </w:tr>
+    </w:tbl>
+    <w:p>
+      <w:pPr>
+        <w:rPr>
+          <w:bCs/>
+        </w:rPr>
+      </w:pPr>
+    </w:p>
+    <w:tbl>
+      <w:tblPr>
+        <w:tblStyle w:val="TableGrid"/>
+        <w:tblW w:w="9576" w:type="dxa"/>
+        <w:tblLook w:val="04A0" w:firstRow="1" w:lastRow="0" w:firstColumn="1" w:lastColumn="0" w:noHBand="0" w:noVBand="1"/>
+      </w:tblPr>
+      <w:tblGrid>
+        <w:gridCol w:w="3192"/>
+        <w:gridCol w:w="3192"/>
+        <w:gridCol w:w="3192"/>
+      </w:tblGrid>
+      <w:tr>
+        <w:tc>
+          <w:tcPr>
+            <w:tcW w:w="3192" w:type="dxa"/>
+            <w:vAlign w:val="center"/>
+          </w:tcPr>
+          <w:p>
+            <w:pPr>
+              <w:jc w:val="center"/>
+              <w:rPr>
+                <w:bCs/>
+                <w:sz w:val="22"/>
+                <w:szCs w:val="22"/>
+              </w:rPr>
+            </w:pPr>
+            <w:r>
+              <w:rPr>
+                <w:color w:val="000000"/>
+                <w:sz w:val="22"/>
+                <w:szCs w:val="22"/>
+              </w:rPr>
+              <w:t>A</w:t>
+            </w:r>
+            <w:r>
+              <w:rPr>
+                <w:bCs/>
+                <w:sz w:val="22"/>
+                <w:szCs w:val="22"/>
+              </w:rPr>
+              <w:t>(</w:t>
+            </w:r>
+            <w:r>
+              <w:rPr>
+                <w:bCs/>
+                <w:sz w:val="22"/>
+                <w:szCs w:val="22"/>
+              </w:rPr>
+              <w:t>((P</w:t>
+            </w:r>
+            <w:r>
+              <w:rPr>
+                <w:b/>
+                <w:bCs/>
+                <w:sz w:val="22"/>
+                <w:szCs w:val="22"/>
+              </w:rPr>
+              <w:t xml:space="preserve"> → </w:t>
+            </w:r>
+            <w:r>
+              <w:rPr>
+                <w:bCs/>
+                <w:sz w:val="22"/>
+                <w:szCs w:val="22"/>
+              </w:rPr>
+              <w:t xml:space="preserve">Q) </w:t>
+            </w:r>
+            <w:r>
+              <w:rPr>
+                <w:rFonts w:ascii="Cambria Math" w:hAnsi="Cambria Math" w:cs="Cambria Math"/>
+                <w:bCs/>
+                <w:sz w:val="22"/>
+                <w:szCs w:val="22"/>
+              </w:rPr>
+              <w:t>∧</w:t>
+            </w:r>
+            <w:r>
+              <w:rPr>
+                <w:bCs/>
+                <w:sz w:val="22"/>
+                <w:szCs w:val="22"/>
+              </w:rPr>
+              <w:t xml:space="preserve"> ¬Q)</w:t>
+            </w:r>
+            <w:r>
+              <w:rPr>
+                <w:b/>
+                <w:bCs/>
+                <w:sz w:val="22"/>
+                <w:szCs w:val="22"/>
+              </w:rPr>
+              <w:t xml:space="preserve"> → </w:t>
+            </w:r>
+            <w:r>
+              <w:rPr>
+                <w:bCs/>
+                <w:sz w:val="22"/>
+                <w:szCs w:val="22"/>
+              </w:rPr>
+              <w:t>¬P</w:t>
+            </w:r>
+            <w:r>
+              <w:rPr>
+                <w:bCs/>
+                <w:sz w:val="22"/>
+                <w:szCs w:val="22"/>
+              </w:rPr>
+              <w:t xml:space="preserve">) </w:t>
+            </w:r>
+          </w:p>
+        </w:tc>
+        <w:tc>
+          <w:tcPr>
+            <w:tcW w:w="3192" w:type="dxa"/>
+            <w:vAlign w:val="center"/>
+          </w:tcPr>
+          <w:p>
+            <w:pPr>
+              <w:jc w:val="center"/>
+              <w:rPr>
+                <w:bCs/>
+                <w:sz w:val="22"/>
+                <w:szCs w:val="22"/>
+              </w:rPr>
+            </w:pPr>
+            <w:r>
+              <w:rPr>
+                <w:bCs/>
+                <w:sz w:val="22"/>
+                <w:szCs w:val="22"/>
+              </w:rPr>
+              <w:t>A(</w:t>
+            </w:r>
+            <w:r>
+              <w:rPr>
+                <w:bCs/>
+                <w:sz w:val="22"/>
+                <w:szCs w:val="22"/>
+              </w:rPr>
+              <w:t xml:space="preserve">((P </w:t>
+            </w:r>
+            <w:r>
+              <w:rPr>
+                <w:rFonts w:ascii="Cambria Math" w:hAnsi="Cambria Math" w:cs="Cambria Math"/>
+                <w:color w:val="000000"/>
+                <w:sz w:val="22"/>
+                <w:szCs w:val="22"/>
+              </w:rPr>
+              <w:t>∨</w:t>
+            </w:r>
+            <w:r>
+              <w:rPr>
+                <w:color w:val="000000"/>
+                <w:sz w:val="22"/>
+                <w:szCs w:val="22"/>
+              </w:rPr>
+              <w:t xml:space="preserve"> Q) </w:t>
+            </w:r>
+            <w:r>
+              <w:rPr>
+                <w:rFonts w:ascii="Cambria Math" w:hAnsi="Cambria Math" w:cs="Cambria Math"/>
+                <w:bCs/>
+                <w:sz w:val="22"/>
+                <w:szCs w:val="22"/>
+              </w:rPr>
+              <w:t>∧</w:t>
+            </w:r>
+            <w:r>
+              <w:rPr>
+                <w:bCs/>
+                <w:sz w:val="22"/>
+                <w:szCs w:val="22"/>
+              </w:rPr>
+              <w:t xml:space="preserve"> ¬P) </w:t>
+            </w:r>
+            <w:r>
+              <w:rPr>
+                <w:b/>
+                <w:bCs/>
+                <w:sz w:val="22"/>
+                <w:szCs w:val="22"/>
+              </w:rPr>
+              <w:t xml:space="preserve">→ </w:t>
+            </w:r>
+            <w:r>
+              <w:rPr>
+                <w:bCs/>
+                <w:sz w:val="22"/>
+                <w:szCs w:val="22"/>
+              </w:rPr>
+              <w:t>Q</w:t>
+            </w:r>
+            <w:r>
+              <w:rPr>
+                <w:bCs/>
+                <w:sz w:val="22"/>
+                <w:szCs w:val="22"/>
+              </w:rPr>
+              <w:t>)</w:t>
+            </w:r>
+          </w:p>
+        </w:tc>
+        <w:tc>
+          <w:tcPr>
+            <w:tcW w:w="3192" w:type="dxa"/>
+            <w:vAlign w:val="center"/>
+          </w:tcPr>
+          <w:p>
+            <w:pPr>
+              <w:jc w:val="center"/>
+              <w:rPr>
+                <w:bCs/>
+                <w:sz w:val="22"/>
+                <w:szCs w:val="22"/>
+              </w:rPr>
+            </w:pPr>
+            <w:r>
+              <w:rPr>
+                <w:bCs/>
+                <w:sz w:val="22"/>
+                <w:szCs w:val="22"/>
+              </w:rPr>
+              <w:t>A</w:t>
+            </w:r>
+            <w:r>
+              <w:rPr>
+                <w:bCs/>
+                <w:sz w:val="22"/>
+                <w:szCs w:val="22"/>
+              </w:rPr>
+              <w:t>(</w:t>
+            </w:r>
+            <w:r>
+              <w:rPr>
+                <w:bCs/>
+                <w:sz w:val="22"/>
+                <w:szCs w:val="22"/>
+              </w:rPr>
+              <w:t xml:space="preserve">(¬(P </w:t>
+            </w:r>
+            <w:r>
+              <w:rPr>
+                <w:rFonts w:ascii="Cambria Math" w:hAnsi="Cambria Math" w:cs="Cambria Math"/>
+                <w:bCs/>
+                <w:sz w:val="22"/>
+                <w:szCs w:val="22"/>
+              </w:rPr>
+              <w:t>∧</w:t>
+            </w:r>
+            <w:r>
+              <w:rPr>
+                <w:bCs/>
+                <w:sz w:val="22"/>
+                <w:szCs w:val="22"/>
+              </w:rPr>
+              <w:t xml:space="preserve"> Q) </w:t>
+            </w:r>
+            <w:r>
+              <w:rPr>
+                <w:rFonts w:ascii="Cambria Math" w:hAnsi="Cambria Math" w:cs="Cambria Math"/>
+                <w:bCs/>
+                <w:sz w:val="22"/>
+                <w:szCs w:val="22"/>
+              </w:rPr>
+              <w:t>∧</w:t>
+            </w:r>
+            <w:r>
+              <w:rPr>
+                <w:bCs/>
+                <w:sz w:val="22"/>
+                <w:szCs w:val="22"/>
+              </w:rPr>
+              <w:t xml:space="preserve"> P) </w:t>
+            </w:r>
+            <w:r>
+              <w:rPr>
+                <w:b/>
+                <w:bCs/>
+                <w:sz w:val="22"/>
+                <w:szCs w:val="22"/>
+              </w:rPr>
+              <w:t xml:space="preserve">→ </w:t>
+            </w:r>
+            <w:r>
+              <w:rPr>
+                <w:bCs/>
+                <w:sz w:val="22"/>
+                <w:szCs w:val="22"/>
+              </w:rPr>
+              <w:t>¬Q</w:t>
+            </w:r>
+            <w:r>
+              <w:rPr>
+                <w:bCs/>
+                <w:sz w:val="22"/>
+                <w:szCs w:val="22"/>
+              </w:rPr>
+              <w:t>)</w:t>
+            </w:r>
+          </w:p>
+        </w:tc>
+      </w:tr>
+      <w:tr>
+        <w:tc>
+          <w:tcPr>
+            <w:tcW w:w="3192" w:type="dxa"/>
+            <w:vAlign w:val="center"/>
+          </w:tcPr>
+          <w:p>
+            <w:pPr>
+              <w:jc w:val="center"/>
+              <w:rPr>
+                <w:bCs/>
+                <w:sz w:val="22"/>
+                <w:szCs w:val="22"/>
+              </w:rPr>
+            </w:pPr>
+            <w:r>
+              <w:rPr>
+                <w:color w:val="000000"/>
+                <w:sz w:val="22"/>
+                <w:szCs w:val="22"/>
+              </w:rPr>
+              <w:t>1</w:t>
+            </w:r>
+          </w:p>
+        </w:tc>
+        <w:tc>
+          <w:tcPr>
+            <w:tcW w:w="3192" w:type="dxa"/>
+            <w:vAlign w:val="center"/>
+          </w:tcPr>
+          <w:p>
+            <w:pPr>
+              <w:jc w:val="center"/>
+              <w:rPr>
+                <w:bCs/>
+                <w:sz w:val="22"/>
+                <w:szCs w:val="22"/>
+              </w:rPr>
+            </w:pPr>
+            <w:r>
+              <w:rPr>
+                <w:color w:val="000000"/>
+                <w:sz w:val="22"/>
+                <w:szCs w:val="22"/>
+              </w:rPr>
+              <w:t>1</w:t>
+            </w:r>
+          </w:p>
+        </w:tc>
+        <w:tc>
+          <w:tcPr>
+            <w:tcW w:w="3192" w:type="dxa"/>
+            <w:vAlign w:val="center"/>
+          </w:tcPr>
+          <w:p>
+            <w:pPr>
+              <w:jc w:val="center"/>
+              <w:rPr>
+                <w:bCs/>
+                <w:sz w:val="22"/>
+                <w:szCs w:val="22"/>
+              </w:rPr>
+            </w:pPr>
+            <w:r>
+              <w:rPr>
+                <w:bCs/>
+                <w:sz w:val="22"/>
+                <w:szCs w:val="22"/>
+              </w:rPr>
+              <w:t>1</w:t>
+            </w:r>
+          </w:p>
+        </w:tc>
+      </w:tr>
+      <w:tr>
+        <w:tc>
+          <w:tcPr>
+            <w:tcW w:w="3192" w:type="dxa"/>
+            <w:vAlign w:val="center"/>
+          </w:tcPr>
+          <w:p>
+            <w:pPr>
+              <w:jc w:val="center"/>
+              <w:rPr>
+                <w:bCs/>
+                <w:sz w:val="22"/>
+                <w:szCs w:val="22"/>
+              </w:rPr>
+            </w:pPr>
+            <w:r>
+              <w:rPr>
+                <w:bCs/>
+                <w:sz w:val="22"/>
+                <w:szCs w:val="22"/>
+              </w:rPr>
+              <w:t>1</w:t>
+            </w:r>
+          </w:p>
+        </w:tc>
+        <w:tc>
+          <w:tcPr>
+            <w:tcW w:w="3192" w:type="dxa"/>
+            <w:vAlign w:val="center"/>
+          </w:tcPr>
+          <w:p>
+            <w:pPr>
+              <w:jc w:val="center"/>
+              <w:rPr>
+                <w:bCs/>
+                <w:sz w:val="22"/>
+                <w:szCs w:val="22"/>
+              </w:rPr>
+            </w:pPr>
+            <w:r>
+              <w:rPr>
+                <w:bCs/>
+                <w:sz w:val="22"/>
+                <w:szCs w:val="22"/>
+              </w:rPr>
+              <w:t>1</w:t>
+            </w:r>
+          </w:p>
+        </w:tc>
+        <w:tc>
+          <w:tcPr>
+            <w:tcW w:w="3192" w:type="dxa"/>
+            <w:vAlign w:val="center"/>
+          </w:tcPr>
+          <w:p>
+            <w:pPr>
+              <w:jc w:val="center"/>
+              <w:rPr>
+                <w:bCs/>
+                <w:sz w:val="22"/>
+                <w:szCs w:val="22"/>
+              </w:rPr>
+            </w:pPr>
+            <w:r>
+              <w:rPr>
+                <w:bCs/>
+                <w:sz w:val="22"/>
+                <w:szCs w:val="22"/>
+              </w:rPr>
+              <w:t>1</w:t>
+            </w:r>
+          </w:p>
+        </w:tc>
+      </w:tr>
+      <w:tr>
+        <w:tc>
+          <w:tcPr>
+            <w:tcW w:w="3192" w:type="dxa"/>
+            <w:vAlign w:val="center"/>
+          </w:tcPr>
+          <w:p>
+            <w:pPr>
+              <w:jc w:val="center"/>
+              <w:rPr>
+                <w:bCs/>
+                <w:sz w:val="22"/>
+                <w:szCs w:val="22"/>
+              </w:rPr>
+            </w:pPr>
+            <w:r>
+              <w:rPr>
+                <w:bCs/>
+                <w:sz w:val="22"/>
+                <w:szCs w:val="22"/>
+              </w:rPr>
+              <w:t>1</w:t>
+            </w:r>
+          </w:p>
+        </w:tc>
+        <w:tc>
+          <w:tcPr>
+            <w:tcW w:w="3192" w:type="dxa"/>
+            <w:vAlign w:val="center"/>
+          </w:tcPr>
+          <w:p>
+            <w:pPr>
+              <w:jc w:val="center"/>
+              <w:rPr>
+                <w:bCs/>
+                <w:sz w:val="22"/>
+                <w:szCs w:val="22"/>
+              </w:rPr>
+            </w:pPr>
+            <w:r>
+              <w:rPr>
+                <w:bCs/>
+                <w:sz w:val="22"/>
+                <w:szCs w:val="22"/>
+              </w:rPr>
+              <w:t>1</w:t>
+            </w:r>
+          </w:p>
+        </w:tc>
+        <w:tc>
+          <w:tcPr>
+            <w:tcW w:w="3192" w:type="dxa"/>
+            <w:vAlign w:val="center"/>
+          </w:tcPr>
+          <w:p>
+            <w:pPr>
+              <w:jc w:val="center"/>
+              <w:rPr>
+                <w:bCs/>
+                <w:sz w:val="22"/>
+                <w:szCs w:val="22"/>
+              </w:rPr>
+            </w:pPr>
+            <w:r>
+              <w:rPr>
+                <w:bCs/>
+                <w:sz w:val="22"/>
+                <w:szCs w:val="22"/>
+              </w:rPr>
+              <w:t>1</w:t>
+            </w:r>
+          </w:p>
+        </w:tc>
+      </w:tr>
+      <w:tr>
+        <w:tc>
+          <w:tcPr>
+            <w:tcW w:w="3192" w:type="dxa"/>
+            <w:vAlign w:val="center"/>
+          </w:tcPr>
+          <w:p>
+            <w:pPr>
+              <w:jc w:val="center"/>
+              <w:rPr>
+                <w:bCs/>
+                <w:sz w:val="22"/>
+                <w:szCs w:val="22"/>
+              </w:rPr>
+            </w:pPr>
+            <w:r>
+              <w:rPr>
+                <w:bCs/>
+                <w:sz w:val="22"/>
+                <w:szCs w:val="22"/>
+              </w:rPr>
+              <w:t>1</w:t>
+            </w:r>
+          </w:p>
+        </w:tc>
+        <w:tc>
+          <w:tcPr>
+            <w:tcW w:w="3192" w:type="dxa"/>
+            <w:vAlign w:val="center"/>
+          </w:tcPr>
+          <w:p>
+            <w:pPr>
+              <w:jc w:val="center"/>
+              <w:rPr>
+                <w:bCs/>
+                <w:sz w:val="22"/>
+                <w:szCs w:val="22"/>
+              </w:rPr>
+            </w:pPr>
+            <w:r>
+              <w:rPr>
+                <w:bCs/>
+                <w:sz w:val="22"/>
+                <w:szCs w:val="22"/>
+              </w:rPr>
+              <w:t>1</w:t>
+            </w:r>
+          </w:p>
+        </w:tc>
+        <w:tc>
+          <w:tcPr>
+            <w:tcW w:w="3192" w:type="dxa"/>
+            <w:vAlign w:val="center"/>
+          </w:tcPr>
+          <w:p>
+            <w:pPr>
+              <w:jc w:val="center"/>
+              <w:rPr>
+                <w:bCs/>
+                <w:sz w:val="22"/>
+                <w:szCs w:val="22"/>
+              </w:rPr>
+            </w:pPr>
+            <w:r>
+              <w:rPr>
+                <w:bCs/>
+                <w:sz w:val="22"/>
+                <w:szCs w:val="22"/>
+              </w:rPr>
+              <w:t>1</w:t>
+            </w:r>
+          </w:p>
+        </w:tc>
+      </w:tr>
+    </w:tbl>
+    <w:p>
+      <w:pPr>
+        <w:rPr>
+          <w:bCs/>
+        </w:rPr>
+      </w:pPr>
+    </w:p>
+    <w:p>
+      <w:pPr>
+        <w:rPr>
+          <w:bCs/>
+        </w:rPr>
+      </w:pPr>
+      <w:r>
+        <w:rPr>
+          <w:bCs/>
+        </w:rPr>
+        <w:t>Because all of the conclusions’ columns are all true, this means that all of the modi are true.</w:t>
+      </w:r>
+    </w:p>
+    <w:p>
+      <w:pPr>
+        <w:rPr>
+          <w:b/>
+        </w:rPr>
+      </w:pPr>
+    </w:p>
+    <w:p>
+      <w:pPr>
+        <w:rPr>
+          <w:b/>
+        </w:rPr>
+      </w:pPr>
+    </w:p>
+    <w:p>
+      <w:pPr>
+        <w:rPr>
+          <w:b/>
+        </w:rPr>
+      </w:pPr>
+    </w:p>
+    <w:p>
+      <w:pPr>
+        <w:rPr>
+          <w:b/>
+        </w:rPr>
+      </w:pPr>
+    </w:p>
+    <w:p>
+      <w:pPr>
+        <w:rPr>
+          <w:b/>
+        </w:rPr>
+      </w:pPr>
+      <w:r>
+        <w:rPr>
+          <w:b/>
+        </w:rPr>
+        <w:lastRenderedPageBreak/>
+        <w:t>Exercise 36</w:t>
+      </w:r>
+    </w:p>
+    <w:p>
+      <w:pPr>
+        <w:pStyle w:val="ListParagraph"/>
+        <w:numPr>
+          <w:ilvl w:val="0"/>
+          <w:numId w:val="2"/>
+        </w:numPr>
+        <w:rPr>
+          <w:bCs/>
+        </w:rPr>
+      </w:pPr>
+      <w:r>
+        <w:rPr>
+          <w:bCs/>
+        </w:rPr>
+        <w:t xml:space="preserve">Not satisfiable because </w:t>
+      </w:r>
+      <w:r>
+        <w:rPr>
+          <w:bCs/>
+        </w:rPr>
+        <w:t>C</w:t>
+      </w:r>
+      <w:r>
+        <w:rPr>
+          <w:bCs/>
+        </w:rPr>
+        <w:t xml:space="preserve"> </w:t>
+      </w:r>
+      <w:r>
+        <w:rPr>
+          <w:rFonts w:ascii="Cambria Math" w:hAnsi="Cambria Math" w:cs="Cambria Math"/>
+          <w:bCs/>
+        </w:rPr>
+        <w:t>∧</w:t>
+      </w:r>
+      <w:r>
+        <w:rPr>
+          <w:rFonts w:ascii="Cambria Math" w:hAnsi="Cambria Math" w:cs="Cambria Math"/>
+          <w:bCs/>
+        </w:rPr>
+        <w:t xml:space="preserve"> </w:t>
+      </w:r>
+      <w:r>
+        <w:rPr>
+          <w:bCs/>
+        </w:rPr>
+        <w:t>¬C</w:t>
+      </w:r>
+      <w:r>
+        <w:rPr>
+          <w:bCs/>
+        </w:rPr>
+        <w:t xml:space="preserve"> is never true as shown below.</w:t>
+      </w:r>
+    </w:p>
+    <w:tbl>
+      <w:tblPr>
+        <w:tblStyle w:val="TableGrid"/>
+        <w:tblW w:w="0" w:type="auto"/>
+        <w:tblLook w:val="04A0" w:firstRow="1" w:lastRow="0" w:firstColumn="1" w:lastColumn="0" w:noHBand="0" w:noVBand="1"/>
+      </w:tblPr>
+      <w:tblGrid>
+        <w:gridCol w:w="3192"/>
+        <w:gridCol w:w="3192"/>
+        <w:gridCol w:w="3192"/>
+      </w:tblGrid>
+      <w:tr>
+        <w:tc>
+          <w:tcPr>
+            <w:tcW w:w="3192" w:type="dxa"/>
+            <w:vAlign w:val="center"/>
+          </w:tcPr>
+          <w:p>
+            <w:pPr>
+              <w:jc w:val="center"/>
+              <w:rPr>
+                <w:bCs/>
+              </w:rPr>
+            </w:pPr>
+            <w:r>
+              <w:rPr>
+                <w:bCs/>
+              </w:rPr>
+              <w:t>C</w:t>
+            </w:r>
+          </w:p>
+        </w:tc>
+        <w:tc>
+          <w:tcPr>
+            <w:tcW w:w="3192" w:type="dxa"/>
+            <w:vAlign w:val="center"/>
+          </w:tcPr>
+          <w:p>
+            <w:pPr>
+              <w:jc w:val="center"/>
+              <w:rPr>
+                <w:bCs/>
+              </w:rPr>
+            </w:pPr>
+            <w:r>
+              <w:rPr>
+                <w:bCs/>
+              </w:rPr>
+              <w:t>¬</w:t>
+            </w:r>
+            <w:r>
+              <w:rPr>
+                <w:bCs/>
+              </w:rPr>
+              <w:t>C</w:t>
+            </w:r>
+          </w:p>
+        </w:tc>
+        <w:tc>
+          <w:tcPr>
+            <w:tcW w:w="3192" w:type="dxa"/>
+            <w:vAlign w:val="center"/>
+          </w:tcPr>
+          <w:p>
+            <w:pPr>
+              <w:jc w:val="center"/>
+              <w:rPr>
+                <w:bCs/>
+              </w:rPr>
+            </w:pPr>
+            <w:r>
+              <w:rPr>
+                <w:bCs/>
+              </w:rPr>
+              <w:t>C</w:t>
+            </w:r>
+            <w:r>
+              <w:rPr>
+                <w:bCs/>
+              </w:rPr>
+              <w:t xml:space="preserve"> </w:t>
+            </w:r>
+            <w:r>
+              <w:rPr>
+                <w:rFonts w:ascii="Cambria Math" w:hAnsi="Cambria Math" w:cs="Cambria Math"/>
+                <w:bCs/>
+              </w:rPr>
+              <w:t>∧</w:t>
+            </w:r>
+            <w:r>
+              <w:rPr>
+                <w:rFonts w:ascii="Cambria Math" w:hAnsi="Cambria Math" w:cs="Cambria Math"/>
+                <w:bCs/>
+              </w:rPr>
+              <w:t xml:space="preserve"> </w:t>
+            </w:r>
+            <w:r>
+              <w:rPr>
+                <w:bCs/>
+              </w:rPr>
+              <w:t>¬C</w:t>
+            </w:r>
+          </w:p>
+        </w:tc>
+      </w:tr>
+      <w:tr>
+        <w:tc>
+          <w:tcPr>
+            <w:tcW w:w="3192" w:type="dxa"/>
+            <w:vAlign w:val="center"/>
+          </w:tcPr>
+          <w:p>
+            <w:pPr>
+              <w:jc w:val="center"/>
+              <w:rPr>
+                <w:bCs/>
+              </w:rPr>
+            </w:pPr>
+            <w:r>
+              <w:rPr>
+                <w:bCs/>
+              </w:rPr>
+              <w:t>0</w:t>
+            </w:r>
+          </w:p>
+        </w:tc>
+        <w:tc>
+          <w:tcPr>
+            <w:tcW w:w="3192" w:type="dxa"/>
+            <w:vAlign w:val="center"/>
+          </w:tcPr>
+          <w:p>
+            <w:pPr>
+              <w:jc w:val="center"/>
+              <w:rPr>
+                <w:bCs/>
+              </w:rPr>
+            </w:pPr>
+            <w:r>
+              <w:rPr>
+                <w:bCs/>
+              </w:rPr>
+              <w:t>1</w:t>
+            </w:r>
+          </w:p>
+        </w:tc>
+        <w:tc>
+          <w:tcPr>
+            <w:tcW w:w="3192" w:type="dxa"/>
+            <w:vAlign w:val="center"/>
+          </w:tcPr>
+          <w:p>
+            <w:pPr>
+              <w:jc w:val="center"/>
+              <w:rPr>
+                <w:bCs/>
+              </w:rPr>
+            </w:pPr>
+            <w:r>
+              <w:rPr>
+                <w:bCs/>
+              </w:rPr>
+              <w:t>0</w:t>
+            </w:r>
+          </w:p>
+        </w:tc>
+      </w:tr>
+      <w:tr>
+        <w:tc>
+          <w:tcPr>
+            <w:tcW w:w="3192" w:type="dxa"/>
+            <w:vAlign w:val="center"/>
+          </w:tcPr>
+          <w:p>
+            <w:pPr>
+              <w:jc w:val="center"/>
+              <w:rPr>
+                <w:bCs/>
+              </w:rPr>
+            </w:pPr>
+            <w:r>
+              <w:rPr>
+                <w:bCs/>
+              </w:rPr>
+              <w:t>0</w:t>
+            </w:r>
+          </w:p>
+        </w:tc>
+        <w:tc>
+          <w:tcPr>
+            <w:tcW w:w="3192" w:type="dxa"/>
+            <w:vAlign w:val="center"/>
+          </w:tcPr>
+          <w:p>
+            <w:pPr>
+              <w:jc w:val="center"/>
+              <w:rPr>
+                <w:bCs/>
+              </w:rPr>
+            </w:pPr>
+            <w:r>
+              <w:rPr>
+                <w:bCs/>
+              </w:rPr>
+              <w:t>1</w:t>
+            </w:r>
+          </w:p>
+        </w:tc>
+        <w:tc>
+          <w:tcPr>
+            <w:tcW w:w="3192" w:type="dxa"/>
+            <w:vAlign w:val="center"/>
+          </w:tcPr>
+          <w:p>
+            <w:pPr>
+              <w:jc w:val="center"/>
+              <w:rPr>
+                <w:bCs/>
+              </w:rPr>
+            </w:pPr>
+            <w:r>
+              <w:rPr>
+                <w:bCs/>
+              </w:rPr>
+              <w:t>0</w:t>
+            </w:r>
+          </w:p>
+        </w:tc>
+      </w:tr>
+      <w:tr>
+        <w:tc>
+          <w:tcPr>
+            <w:tcW w:w="3192" w:type="dxa"/>
+            <w:vAlign w:val="center"/>
+          </w:tcPr>
+          <w:p>
+            <w:pPr>
+              <w:jc w:val="center"/>
+              <w:rPr>
+                <w:bCs/>
+              </w:rPr>
+            </w:pPr>
+            <w:r>
+              <w:rPr>
+                <w:bCs/>
+              </w:rPr>
+              <w:t>1</w:t>
+            </w:r>
+          </w:p>
+        </w:tc>
+        <w:tc>
+          <w:tcPr>
+            <w:tcW w:w="3192" w:type="dxa"/>
+            <w:vAlign w:val="center"/>
+          </w:tcPr>
+          <w:p>
+            <w:pPr>
+              <w:jc w:val="center"/>
+              <w:rPr>
+                <w:bCs/>
+              </w:rPr>
+            </w:pPr>
+            <w:r>
+              <w:rPr>
+                <w:bCs/>
+              </w:rPr>
+              <w:t>0</w:t>
+            </w:r>
+          </w:p>
+        </w:tc>
+        <w:tc>
+          <w:tcPr>
+            <w:tcW w:w="3192" w:type="dxa"/>
+            <w:vAlign w:val="center"/>
+          </w:tcPr>
+          <w:p>
+            <w:pPr>
+              <w:jc w:val="center"/>
+              <w:rPr>
+                <w:bCs/>
+              </w:rPr>
+            </w:pPr>
+            <w:r>
+              <w:rPr>
+                <w:bCs/>
+              </w:rPr>
+              <w:t>0</w:t>
+            </w:r>
+          </w:p>
+        </w:tc>
+      </w:tr>
+      <w:tr>
+        <w:tc>
+          <w:tcPr>
+            <w:tcW w:w="3192" w:type="dxa"/>
+            <w:vAlign w:val="center"/>
+          </w:tcPr>
+          <w:p>
+            <w:pPr>
+              <w:jc w:val="center"/>
+              <w:rPr>
+                <w:bCs/>
+              </w:rPr>
+            </w:pPr>
+            <w:r>
+              <w:rPr>
+                <w:bCs/>
+              </w:rPr>
+              <w:t>1</w:t>
+            </w:r>
+          </w:p>
+        </w:tc>
+        <w:tc>
+          <w:tcPr>
+            <w:tcW w:w="3192" w:type="dxa"/>
+            <w:vAlign w:val="center"/>
+          </w:tcPr>
+          <w:p>
+            <w:pPr>
+              <w:jc w:val="center"/>
+              <w:rPr>
+                <w:bCs/>
+              </w:rPr>
+            </w:pPr>
+            <w:r>
+              <w:rPr>
+                <w:bCs/>
+              </w:rPr>
+              <w:t>0</w:t>
+            </w:r>
+          </w:p>
+        </w:tc>
+        <w:tc>
+          <w:tcPr>
+            <w:tcW w:w="3192" w:type="dxa"/>
+            <w:vAlign w:val="center"/>
+          </w:tcPr>
+          <w:p>
+            <w:pPr>
+              <w:jc w:val="center"/>
+              <w:rPr>
+                <w:bCs/>
+              </w:rPr>
+            </w:pPr>
+            <w:r>
+              <w:rPr>
+                <w:bCs/>
+              </w:rPr>
+              <w:t>0</w:t>
+            </w:r>
+          </w:p>
+        </w:tc>
+      </w:tr>
+    </w:tbl>
+    <w:p>
+      <w:pPr>
+        <w:rPr>
+          <w:bCs/>
+        </w:rPr>
+      </w:pPr>
+    </w:p>
+    <w:p>
+      <w:pPr>
+        <w:pStyle w:val="ListParagraph"/>
+        <w:numPr>
+          <w:ilvl w:val="0"/>
+          <w:numId w:val="2"/>
+        </w:numPr>
+        <w:rPr>
+          <w:bCs/>
+        </w:rPr>
+      </w:pPr>
+      <w:r>
+        <w:rPr>
+          <w:bCs/>
+        </w:rPr>
+        <w:t xml:space="preserve">Satisfiable because </w:t>
+      </w:r>
+      <w:r>
+        <w:rPr>
+          <w:bCs/>
+        </w:rPr>
+        <w:t>B → ¬B</w:t>
+      </w:r>
+      <w:r>
+        <w:rPr>
+          <w:bCs/>
+        </w:rPr>
+        <w:t xml:space="preserve"> is true for model A(B) = 0.</w:t>
       </w:r>
     </w:p>
     <w:sectPr>
@@ -9882,6 +12976,195 @@
     </w:sectPr>
   </w:body>
 </w:document>
+</file>
+
+<file path=word/numbering.xml><?xml version="1.0" encoding="utf-8"?>
+<w:numbering xmlns:wpc="http://schemas.microsoft.com/office/word/2010/wordprocessingCanvas" xmlns:cx="http://schemas.microsoft.com/office/drawing/2014/chartex" xmlns:cx1="http://schemas.microsoft.com/office/drawing/2015/9/8/chartex" xmlns:cx2="http://schemas.microsoft.com/office/drawing/2015/10/21/chartex" xmlns:cx3="http://schemas.microsoft.com/office/drawing/2016/5/9/chartex" xmlns:cx4="http://schemas.microsoft.com/office/drawing/2016/5/10/chartex" xmlns:cx5="http://schemas.microsoft.com/office/drawing/2016/5/11/chartex" xmlns:cx6="http://schemas.microsoft.com/office/drawing/2016/5/12/chartex" xmlns:cx7="http://schemas.microsoft.com/office/drawing/2016/5/13/chartex" xmlns:cx8="http://schemas.microsoft.com/office/drawing/2016/5/14/chartex" xmlns:mc="http://schemas.openxmlformats.org/markup-compatibility/2006" xmlns:aink="http://schemas.microsoft.com/office/drawing/2016/ink" xmlns:am3d="http://schemas.microsoft.com/office/drawing/2017/model3d" xmlns:o="urn:schemas-microsoft-com:office:office" xmlns:oel="http://schemas.microsoft.com/office/2019/extlst" xmlns:r="http://schemas.openxmlformats.org/officeDocument/2006/relationships" xmlns:m="http://schemas.openxmlformats.org/officeDocument/2006/math" xmlns:v="urn:schemas-microsoft-com:vml" xmlns:wp14="http://schemas.microsoft.com/office/word/2010/wordprocessingDrawing" xmlns:wp="http://schemas.openxmlformats.org/drawingml/2006/wordprocessingDrawing" xmlns:w10="urn:schemas-microsoft-com:office:word" xmlns:w="http://schemas.openxmlformats.org/wordprocessingml/2006/main" xmlns:w14="http://schemas.microsoft.com/office/word/2010/wordml" xmlns:w15="http://schemas.microsoft.com/office/word/2012/wordml" xmlns:w16cex="http://schemas.microsoft.com/office/word/2018/wordml/cex" xmlns:w16cid="http://schemas.microsoft.com/office/word/2016/wordml/cid" xmlns:w16="http://schemas.microsoft.com/office/word/2018/wordml" xmlns:w16du="http://schemas.microsoft.com/office/word/2023/wordml/word16du" xmlns:w16sdtdh="http://schemas.microsoft.com/office/word/2020/wordml/sdtdatahash" xmlns:w16sdtfl="http://schemas.microsoft.com/office/word/2024/wordml/sdtformatlock" xmlns:w16se="http://schemas.microsoft.com/office/word/2015/wordml/symex" xmlns:wpg="http://schemas.microsoft.com/office/word/2010/wordprocessingGroup" xmlns:wpi="http://schemas.microsoft.com/office/word/2010/wordprocessingInk" xmlns:wne="http://schemas.microsoft.com/office/word/2006/wordml" xmlns:wps="http://schemas.microsoft.com/office/word/2010/wordprocessingShape" mc:Ignorable="w14 w15 w16se w16cid w16 w16cex w16sdtdh w16sdtfl w16du wp14">
+  <w:abstractNum w:abstractNumId="0" w15:restartNumberingAfterBreak="0">
+    <w:nsid w:val="3A2B4A79"/>
+    <w:multiLevelType w:val="hybridMultilevel"/>
+    <w:tmpl w:val="60064B72"/>
+    <w:lvl w:ilvl="0" w:tplc="04090019">
+      <w:start w:val="1"/>
+      <w:numFmt w:val="lowerLetter"/>
+      <w:lvlText w:val="%1."/>
+      <w:lvlJc w:val="left"/>
+      <w:pPr>
+        <w:ind w:left="720" w:hanging="360"/>
+      </w:pPr>
+      <w:rPr>
+        <w:rFonts w:hint="default"/>
+      </w:rPr>
+    </w:lvl>
+    <w:lvl w:ilvl="1" w:tplc="04090019" w:tentative="1">
+      <w:start w:val="1"/>
+      <w:numFmt w:val="lowerLetter"/>
+      <w:lvlText w:val="%2."/>
+      <w:lvlJc w:val="left"/>
+      <w:pPr>
+        <w:ind w:left="1440" w:hanging="360"/>
+      </w:pPr>
+    </w:lvl>
+    <w:lvl w:ilvl="2" w:tplc="0409001B" w:tentative="1">
+      <w:start w:val="1"/>
+      <w:numFmt w:val="lowerRoman"/>
+      <w:lvlText w:val="%3."/>
+      <w:lvlJc w:val="right"/>
+      <w:pPr>
+        <w:ind w:left="2160" w:hanging="180"/>
+      </w:pPr>
+    </w:lvl>
+    <w:lvl w:ilvl="3" w:tplc="0409000F" w:tentative="1">
+      <w:start w:val="1"/>
+      <w:numFmt w:val="decimal"/>
+      <w:lvlText w:val="%4."/>
+      <w:lvlJc w:val="left"/>
+      <w:pPr>
+        <w:ind w:left="2880" w:hanging="360"/>
+      </w:pPr>
+    </w:lvl>
+    <w:lvl w:ilvl="4" w:tplc="04090019" w:tentative="1">
+      <w:start w:val="1"/>
+      <w:numFmt w:val="lowerLetter"/>
+      <w:lvlText w:val="%5."/>
+      <w:lvlJc w:val="left"/>
+      <w:pPr>
+        <w:ind w:left="3600" w:hanging="360"/>
+      </w:pPr>
+    </w:lvl>
+    <w:lvl w:ilvl="5" w:tplc="0409001B" w:tentative="1">
+      <w:start w:val="1"/>
+      <w:numFmt w:val="lowerRoman"/>
+      <w:lvlText w:val="%6."/>
+      <w:lvlJc w:val="right"/>
+      <w:pPr>
+        <w:ind w:left="4320" w:hanging="180"/>
+      </w:pPr>
+    </w:lvl>
+    <w:lvl w:ilvl="6" w:tplc="0409000F" w:tentative="1">
+      <w:start w:val="1"/>
+      <w:numFmt w:val="decimal"/>
+      <w:lvlText w:val="%7."/>
+      <w:lvlJc w:val="left"/>
+      <w:pPr>
+        <w:ind w:left="5040" w:hanging="360"/>
+      </w:pPr>
+    </w:lvl>
+    <w:lvl w:ilvl="7" w:tplc="04090019" w:tentative="1">
+      <w:start w:val="1"/>
+      <w:numFmt w:val="lowerLetter"/>
+      <w:lvlText w:val="%8."/>
+      <w:lvlJc w:val="left"/>
+      <w:pPr>
+        <w:ind w:left="5760" w:hanging="360"/>
+      </w:pPr>
+    </w:lvl>
+    <w:lvl w:ilvl="8" w:tplc="0409001B" w:tentative="1">
+      <w:start w:val="1"/>
+      <w:numFmt w:val="lowerRoman"/>
+      <w:lvlText w:val="%9."/>
+      <w:lvlJc w:val="right"/>
+      <w:pPr>
+        <w:ind w:left="6480" w:hanging="180"/>
+      </w:pPr>
+    </w:lvl>
+  </w:abstractNum>
+  <w:abstractNum w:abstractNumId="1" w15:restartNumberingAfterBreak="0">
+    <w:nsid w:val="64EF6765"/>
+    <w:multiLevelType w:val="hybridMultilevel"/>
+    <w:tmpl w:val="625009C4"/>
+    <w:lvl w:ilvl="0" w:tplc="04090019">
+      <w:start w:val="1"/>
+      <w:numFmt w:val="lowerLetter"/>
+      <w:lvlText w:val="%1."/>
+      <w:lvlJc w:val="left"/>
+      <w:pPr>
+        <w:ind w:left="720" w:hanging="360"/>
+      </w:pPr>
+      <w:rPr>
+        <w:rFonts w:hint="default"/>
+      </w:rPr>
+    </w:lvl>
+    <w:lvl w:ilvl="1" w:tplc="04090019" w:tentative="1">
+      <w:start w:val="1"/>
+      <w:numFmt w:val="lowerLetter"/>
+      <w:lvlText w:val="%2."/>
+      <w:lvlJc w:val="left"/>
+      <w:pPr>
+        <w:ind w:left="1440" w:hanging="360"/>
+      </w:pPr>
+    </w:lvl>
+    <w:lvl w:ilvl="2" w:tplc="0409001B" w:tentative="1">
+      <w:start w:val="1"/>
+      <w:numFmt w:val="lowerRoman"/>
+      <w:lvlText w:val="%3."/>
+      <w:lvlJc w:val="right"/>
+      <w:pPr>
+        <w:ind w:left="2160" w:hanging="180"/>
+      </w:pPr>
+    </w:lvl>
+    <w:lvl w:ilvl="3" w:tplc="0409000F" w:tentative="1">
+      <w:start w:val="1"/>
+      <w:numFmt w:val="decimal"/>
+      <w:lvlText w:val="%4."/>
+      <w:lvlJc w:val="left"/>
+      <w:pPr>
+        <w:ind w:left="2880" w:hanging="360"/>
+      </w:pPr>
+    </w:lvl>
+    <w:lvl w:ilvl="4" w:tplc="04090019" w:tentative="1">
+      <w:start w:val="1"/>
+      <w:numFmt w:val="lowerLetter"/>
+      <w:lvlText w:val="%5."/>
+      <w:lvlJc w:val="left"/>
+      <w:pPr>
+        <w:ind w:left="3600" w:hanging="360"/>
+      </w:pPr>
+    </w:lvl>
+    <w:lvl w:ilvl="5" w:tplc="0409001B" w:tentative="1">
+      <w:start w:val="1"/>
+      <w:numFmt w:val="lowerRoman"/>
+      <w:lvlText w:val="%6."/>
+      <w:lvlJc w:val="right"/>
+      <w:pPr>
+        <w:ind w:left="4320" w:hanging="180"/>
+      </w:pPr>
+    </w:lvl>
+    <w:lvl w:ilvl="6" w:tplc="0409000F" w:tentative="1">
+      <w:start w:val="1"/>
+      <w:numFmt w:val="decimal"/>
+      <w:lvlText w:val="%7."/>
+      <w:lvlJc w:val="left"/>
+      <w:pPr>
+        <w:ind w:left="5040" w:hanging="360"/>
+      </w:pPr>
+    </w:lvl>
+    <w:lvl w:ilvl="7" w:tplc="04090019" w:tentative="1">
+      <w:start w:val="1"/>
+      <w:numFmt w:val="lowerLetter"/>
+      <w:lvlText w:val="%8."/>
+      <w:lvlJc w:val="left"/>
+      <w:pPr>
+        <w:ind w:left="5760" w:hanging="360"/>
+      </w:pPr>
+    </w:lvl>
+    <w:lvl w:ilvl="8" w:tplc="0409001B" w:tentative="1">
+      <w:start w:val="1"/>
+      <w:numFmt w:val="lowerRoman"/>
+      <w:lvlText w:val="%9."/>
+      <w:lvlJc w:val="right"/>
+      <w:pPr>
+        <w:ind w:left="6480" w:hanging="180"/>
+      </w:pPr>
+    </w:lvl>
+  </w:abstractNum>
+  <w:num w:numId="1" w16cid:durableId="1361859193">
+    <w:abstractNumId w:val="1"/>
+  </w:num>
+  <w:num w:numId="2" w16cid:durableId="1238324534">
+    <w:abstractNumId w:val="0"/>
+  </w:num>
+</w:numbering>
 </file>
 
 <file path=word/styles.xml><?xml version="1.0" encoding="utf-8"?>
@@ -10284,7 +13567,7 @@
   <w:style w:type="paragraph" w:default="1" w:styleId="Normal">
     <w:name w:val="Normal"/>
     <w:qFormat/>
-    <w:rsid w:val="00396682"/>
+    <w:rsid w:val="001B2B68"/>
     <w:pPr>
       <w:spacing w:line="480" w:lineRule="auto"/>
     </w:pPr>
@@ -10887,6 +14170,22 @@
       <w:bCs/>
     </w:rPr>
   </w:style>
+  <w:style w:type="table" w:styleId="TableGrid">
+    <w:name w:val="Table Grid"/>
+    <w:basedOn w:val="TableNormal"/>
+    <w:uiPriority w:val="39"/>
+    <w:rsid w:val="00843CE8"/>
+    <w:tblPr>
+      <w:tblBorders>
+        <w:top w:val="single" w:sz="4" w:space="0" w:color="auto"/>
+        <w:left w:val="single" w:sz="4" w:space="0" w:color="auto"/>
+        <w:bottom w:val="single" w:sz="4" w:space="0" w:color="auto"/>
+        <w:right w:val="single" w:sz="4" w:space="0" w:color="auto"/>
+        <w:insideH w:val="single" w:sz="4" w:space="0" w:color="auto"/>
+        <w:insideV w:val="single" w:sz="4" w:space="0" w:color="auto"/>
+      </w:tblBorders>
+    </w:tblPr>
+  </w:style>
 </w:styles>
 </file>
 

</xml_diff>